<commit_message>
feat(migration): auto-fill missing title fields on load
</commit_message>
<xml_diff>
--- a/data/Aufgaben/Aufgaben_Auftragssteuerung und -koordination.docx
+++ b/data/Aufgaben/Aufgaben_Auftragssteuerung und -koordination.docx
@@ -63,7 +63,9 @@
             <w:tcW w:w="4320" w:type="dxa"/>
           </w:tcPr>
           <w:p>
-            <w:r/>
+            <w:r>
+              <w:t>Sie bereiten sich auf das Treffen vor. Formulie...</w:t>
+            </w:r>
           </w:p>
         </w:tc>
       </w:tr>
@@ -329,7 +331,9 @@
             <w:tcW w:w="4320" w:type="dxa"/>
           </w:tcPr>
           <w:p>
-            <w:r/>
+            <w:r>
+              <w:t>Sie möchten der Böhmer AG möglichst viele Ausst...</w:t>
+            </w:r>
           </w:p>
         </w:tc>
       </w:tr>
@@ -583,7 +587,9 @@
             <w:tcW w:w="4320" w:type="dxa"/>
           </w:tcPr>
           <w:p>
-            <w:r/>
+            <w:r>
+              <w:t>Die Vertriebsmitarbeitenden der Böhmer AG benöt...</w:t>
+            </w:r>
           </w:p>
         </w:tc>
       </w:tr>
@@ -841,7 +847,9 @@
             <w:tcW w:w="4320" w:type="dxa"/>
           </w:tcPr>
           <w:p>
-            <w:r/>
+            <w:r>
+              <w:t>Nach dem Besuch der Mitarbeitenden der Böhmer A...</w:t>
+            </w:r>
           </w:p>
         </w:tc>
       </w:tr>
@@ -1111,7 +1119,9 @@
             <w:tcW w:w="4320" w:type="dxa"/>
           </w:tcPr>
           <w:p>
-            <w:r/>
+            <w:r>
+              <w:t>Am 03. März 20xx bittet Sie die Böhmer AG per E...</w:t>
+            </w:r>
           </w:p>
         </w:tc>
       </w:tr>
@@ -1380,7 +1390,9 @@
             <w:tcW w:w="4320" w:type="dxa"/>
           </w:tcPr>
           <w:p>
-            <w:r/>
+            <w:r>
+              <w:t>Welche rechtliche Möglichkeit hat die INN-Büro ...</w:t>
+            </w:r>
           </w:p>
         </w:tc>
       </w:tr>
@@ -1640,7 +1652,9 @@
             <w:tcW w:w="4320" w:type="dxa"/>
           </w:tcPr>
           <w:p>
-            <w:r/>
+            <w:r>
+              <w:t>Ordnen Sie zu, indem die Kennziffern der rechtl...</w:t>
+            </w:r>
           </w:p>
         </w:tc>
       </w:tr>
@@ -1909,7 +1923,9 @@
             <w:tcW w:w="4320" w:type="dxa"/>
           </w:tcPr>
           <w:p>
-            <w:r/>
+            <w:r>
+              <w:t>Schreiben Sie in ganzen Sätzen, nicht stichwort...</w:t>
+            </w:r>
           </w:p>
         </w:tc>
       </w:tr>
@@ -2175,7 +2191,9 @@
             <w:tcW w:w="4320" w:type="dxa"/>
           </w:tcPr>
           <w:p>
-            <w:r/>
+            <w:r>
+              <w:t>Welche rechtliche Bedeutung hat die Bestellung ...</w:t>
+            </w:r>
           </w:p>
         </w:tc>
       </w:tr>
@@ -2444,7 +2462,9 @@
             <w:tcW w:w="4320" w:type="dxa"/>
           </w:tcPr>
           <w:p>
-            <w:r/>
+            <w:r>
+              <w:t>Geben Sie an, zu welchem Zeitpunkt der Kaufvert...</w:t>
+            </w:r>
           </w:p>
         </w:tc>
       </w:tr>
@@ -2704,7 +2724,9 @@
             <w:tcW w:w="4320" w:type="dxa"/>
           </w:tcPr>
           <w:p>
-            <w:r/>
+            <w:r>
+              <w:t>Das Angebot der INN-Büro GmbH in der Fachzeitsc...</w:t>
+            </w:r>
           </w:p>
         </w:tc>
       </w:tr>
@@ -2935,7 +2957,9 @@
             <w:tcW w:w="4320" w:type="dxa"/>
           </w:tcPr>
           <w:p>
-            <w:r/>
+            <w:r>
+              <w:t>Erläutern Sie einen Vorteil für die INN-Büro Gm...</w:t>
+            </w:r>
           </w:p>
         </w:tc>
       </w:tr>
@@ -3197,7 +3221,9 @@
             <w:tcW w:w="4320" w:type="dxa"/>
           </w:tcPr>
           <w:p>
-            <w:r/>
+            <w:r>
+              <w:t>Geben Sie an, zu welchem Zeitpunkt die Livingst...</w:t>
+            </w:r>
           </w:p>
         </w:tc>
       </w:tr>
@@ -3457,7 +3483,9 @@
             <w:tcW w:w="4320" w:type="dxa"/>
           </w:tcPr>
           <w:p>
-            <w:r/>
+            <w:r>
+              <w:t>Die fehlende Zahlung hätte die INN-Büro GmbH no...</w:t>
+            </w:r>
           </w:p>
         </w:tc>
       </w:tr>
@@ -3717,7 +3745,9 @@
             <w:tcW w:w="4320" w:type="dxa"/>
           </w:tcPr>
           <w:p>
-            <w:r/>
+            <w:r>
+              <w:t>Aufgrund der Mängelrüge der Livingston GmbH wer...</w:t>
+            </w:r>
           </w:p>
         </w:tc>
       </w:tr>
@@ -3983,7 +4013,9 @@
             <w:tcW w:w="4320" w:type="dxa"/>
           </w:tcPr>
           <w:p>
-            <w:r/>
+            <w:r>
+              <w:t>Berechnen Sie die Selbstkosten für die Sonder-A...</w:t>
+            </w:r>
           </w:p>
         </w:tc>
       </w:tr>
@@ -4275,7 +4307,9 @@
             <w:tcW w:w="4320" w:type="dxa"/>
           </w:tcPr>
           <w:p>
-            <w:r/>
+            <w:r>
+              <w:t>Welcher Preis kann für diese Variante des Schre...</w:t>
+            </w:r>
           </w:p>
         </w:tc>
       </w:tr>

</xml_diff>

<commit_message>
feat(gui): add task preview and flow-text export for structured tasks
</commit_message>
<xml_diff>
--- a/data/Aufgaben/Aufgaben_Auftragssteuerung und -koordination.docx
+++ b/data/Aufgaben/Aufgaben_Auftragssteuerung und -koordination.docx
@@ -42,7 +42,7 @@
           </w:tcPr>
           <w:p>
             <w:r>
-              <w:t>A-001</w:t>
+              <w:t>1.0</w:t>
             </w:r>
           </w:p>
         </w:tc>
@@ -87,8 +87,12 @@
           <w:p>
             <w:r>
               <w:t>Auftragsbearbeitung I</w:t>
+            </w:r>
+            <w:r>
               <w:br/>
               <w:t>Die INN-Büro GmbH hat für die neue Produktlinie 'FancyCarbon' geworben. Die Böhmer AG, ein langjähriger Kunde der INN-Büro GmbH, hat aus Norwegen Anfragen zu solchen Produkten erhalten. Einige große Industrieunternehmen benötigen Ausstattungen für Besprechungsräume in edlem Design. Um die INN-Design AG genauer über diese Produkte zu informieren, lädt die INN-Büro GmbH Mitarbeiter aus dem Einkauf und Vertrieb in ihr Unternehmen ein. Sie sind als Mitarbeitende im Verkauf bei diesem Treffen dabei.</w:t>
+            </w:r>
+            <w:r>
               <w:br/>
             </w:r>
           </w:p>
@@ -112,10 +116,18 @@
           <w:p>
             <w:r>
               <w:t>Sie bereiten sich auf das Treffen vor. Formulieren Sie vier Fragen, die Ihnen Mitarbeitende der Böhmer AG zur neuen Produktlinie stellen könnten.</w:t>
+            </w:r>
+            <w:r>
               <w:tab/>
               <w:t>8</w:t>
+            </w:r>
+            <w:r>
               <w:br/>
+            </w:r>
+            <w:r>
               <w:br/>
+            </w:r>
+            <w:r>
               <w:br/>
             </w:r>
           </w:p>
@@ -136,9 +148,7 @@
           <w:tcPr>
             <w:tcW w:w="4320" w:type="dxa"/>
           </w:tcPr>
-          <w:p>
-            <w:r/>
-          </w:p>
+          <w:p/>
         </w:tc>
       </w:tr>
       <w:tr>
@@ -210,7 +220,7 @@
       <w:tr>
         <w:tc>
           <w:tcPr>
-            <w:tcW w:type="dxa" w:w="4320"/>
+            <w:tcW w:w="4320" w:type="dxa"/>
           </w:tcPr>
           <w:p>
             <w:r>
@@ -220,17 +230,15 @@
         </w:tc>
         <w:tc>
           <w:tcPr>
-            <w:tcW w:type="dxa" w:w="4320"/>
-          </w:tcPr>
-          <w:p>
-            <w:r/>
-          </w:p>
+            <w:tcW w:w="4320" w:type="dxa"/>
+          </w:tcPr>
+          <w:p/>
         </w:tc>
       </w:tr>
       <w:tr>
         <w:tc>
           <w:tcPr>
-            <w:tcW w:type="dxa" w:w="4320"/>
+            <w:tcW w:w="4320" w:type="dxa"/>
           </w:tcPr>
           <w:p>
             <w:r>
@@ -240,7 +248,7 @@
         </w:tc>
         <w:tc>
           <w:tcPr>
-            <w:tcW w:type="dxa" w:w="4320"/>
+            <w:tcW w:w="4320" w:type="dxa"/>
           </w:tcPr>
           <w:p>
             <w:r>
@@ -274,14 +282,13 @@
                 <w:lang w:val="en-US"/>
               </w:rPr>
             </w:pPr>
-            <w:bookmarkStart w:id="1" w:name="_Toc125918427"/>
-            <w:bookmarkStart w:id="2" w:name="_Toc107917171"/>
+            <w:bookmarkStart w:id="0" w:name="_Toc125918427"/>
+            <w:bookmarkStart w:id="1" w:name="_Toc107917171"/>
             <w:r>
               <w:rPr>
                 <w:rFonts w:asciiTheme="minorHAnsi" w:hAnsiTheme="minorHAnsi"/>
                 <w:lang w:val="en-US"/>
               </w:rPr>
-              <w:lastRenderedPageBreak/>
               <w:t>ID</w:t>
             </w:r>
           </w:p>
@@ -303,7 +310,7 @@
                 <w:rFonts w:asciiTheme="minorHAnsi" w:hAnsiTheme="minorHAnsi"/>
                 <w:lang w:val="en-US"/>
               </w:rPr>
-              <w:t>A-001</w:t>
+              <w:t>1</w:t>
             </w:r>
             <w:r>
               <w:rPr>
@@ -352,9 +359,7 @@
           <w:tcPr>
             <w:tcW w:w="4320" w:type="dxa"/>
           </w:tcPr>
-          <w:p>
-            <w:r/>
-          </w:p>
+          <w:p/>
         </w:tc>
       </w:tr>
       <w:tr>
@@ -375,6 +380,8 @@
           <w:p>
             <w:r>
               <w:t>Sie möchten der Böhmer AG möglichst viele Ausstattungsmöbel verkaufen und stellen deshalb Besonderheiten der neuen Produkte dar. Was sollten Sie bei diesem Verkaufsgespräch beachten?</w:t>
+            </w:r>
+            <w:r>
               <w:br/>
             </w:r>
           </w:p>
@@ -387,6 +394,7 @@
           </w:tcPr>
           <w:p>
             <w:r>
+              <w:lastRenderedPageBreak/>
               <w:t>Lösungsmöglichkeit/Hinweis (optional)</w:t>
             </w:r>
           </w:p>
@@ -395,9 +403,7 @@
           <w:tcPr>
             <w:tcW w:w="4320" w:type="dxa"/>
           </w:tcPr>
-          <w:p>
-            <w:r/>
-          </w:p>
+          <w:p/>
         </w:tc>
       </w:tr>
       <w:tr>
@@ -469,7 +475,7 @@
       <w:tr>
         <w:tc>
           <w:tcPr>
-            <w:tcW w:type="dxa" w:w="4320"/>
+            <w:tcW w:w="4320" w:type="dxa"/>
           </w:tcPr>
           <w:p>
             <w:r>
@@ -479,17 +485,15 @@
         </w:tc>
         <w:tc>
           <w:tcPr>
-            <w:tcW w:type="dxa" w:w="4320"/>
-          </w:tcPr>
-          <w:p>
-            <w:r/>
-          </w:p>
+            <w:tcW w:w="4320" w:type="dxa"/>
+          </w:tcPr>
+          <w:p/>
         </w:tc>
       </w:tr>
       <w:tr>
         <w:tc>
           <w:tcPr>
-            <w:tcW w:type="dxa" w:w="4320"/>
+            <w:tcW w:w="4320" w:type="dxa"/>
           </w:tcPr>
           <w:p>
             <w:r>
@@ -499,7 +503,7 @@
         </w:tc>
         <w:tc>
           <w:tcPr>
-            <w:tcW w:type="dxa" w:w="4320"/>
+            <w:tcW w:w="4320" w:type="dxa"/>
           </w:tcPr>
           <w:p>
             <w:r>
@@ -559,7 +563,7 @@
                 <w:rFonts w:asciiTheme="minorHAnsi" w:hAnsiTheme="minorHAnsi"/>
                 <w:lang w:val="en-US"/>
               </w:rPr>
-              <w:t>A-001</w:t>
+              <w:t>1</w:t>
             </w:r>
             <w:r>
               <w:rPr>
@@ -608,9 +612,7 @@
           <w:tcPr>
             <w:tcW w:w="4320" w:type="dxa"/>
           </w:tcPr>
-          <w:p>
-            <w:r/>
-          </w:p>
+          <w:p/>
         </w:tc>
       </w:tr>
       <w:tr>
@@ -631,10 +633,18 @@
           <w:p>
             <w:r>
               <w:t>Die Vertriebsmitarbeitenden der Böhmer AG benötigen Informationsmaterial für mögliche Kunden in Norwegen und bitten die INN-Büro GmbH um Unterstützung. Welche Informationsmaterialien können Sie der Böhmer AG zur Verfügung stellen? Benennen Sie zwei Möglichkeiten.</w:t>
+            </w:r>
+            <w:r>
               <w:tab/>
               <w:t>4</w:t>
+            </w:r>
+            <w:r>
               <w:br/>
+            </w:r>
+            <w:r>
               <w:br/>
+            </w:r>
+            <w:r>
               <w:br/>
             </w:r>
           </w:p>
@@ -655,9 +665,7 @@
           <w:tcPr>
             <w:tcW w:w="4320" w:type="dxa"/>
           </w:tcPr>
-          <w:p>
-            <w:r/>
-          </w:p>
+          <w:p/>
         </w:tc>
       </w:tr>
       <w:tr>
@@ -729,7 +737,7 @@
       <w:tr>
         <w:tc>
           <w:tcPr>
-            <w:tcW w:type="dxa" w:w="4320"/>
+            <w:tcW w:w="4320" w:type="dxa"/>
           </w:tcPr>
           <w:p>
             <w:r>
@@ -739,17 +747,15 @@
         </w:tc>
         <w:tc>
           <w:tcPr>
-            <w:tcW w:type="dxa" w:w="4320"/>
-          </w:tcPr>
-          <w:p>
-            <w:r/>
-          </w:p>
+            <w:tcW w:w="4320" w:type="dxa"/>
+          </w:tcPr>
+          <w:p/>
         </w:tc>
       </w:tr>
       <w:tr>
         <w:tc>
           <w:tcPr>
-            <w:tcW w:type="dxa" w:w="4320"/>
+            <w:tcW w:w="4320" w:type="dxa"/>
           </w:tcPr>
           <w:p>
             <w:r>
@@ -759,7 +765,7 @@
         </w:tc>
         <w:tc>
           <w:tcPr>
-            <w:tcW w:type="dxa" w:w="4320"/>
+            <w:tcW w:w="4320" w:type="dxa"/>
           </w:tcPr>
           <w:p>
             <w:r>
@@ -819,7 +825,7 @@
                 <w:rFonts w:asciiTheme="minorHAnsi" w:hAnsiTheme="minorHAnsi"/>
                 <w:lang w:val="en-US"/>
               </w:rPr>
-              <w:t>A-001</w:t>
+              <w:t>1</w:t>
             </w:r>
             <w:r>
               <w:rPr>
@@ -868,9 +874,7 @@
           <w:tcPr>
             <w:tcW w:w="4320" w:type="dxa"/>
           </w:tcPr>
-          <w:p>
-            <w:r/>
-          </w:p>
+          <w:p/>
         </w:tc>
       </w:tr>
       <w:tr>
@@ -891,16 +895,36 @@
           <w:p>
             <w:r>
               <w:t>Nach dem Besuch der Mitarbeitenden der Böhmer AG kalkulieren Sie den Verkaufspreis für einen Besprechungstisch der neuen Produktlinie. Ihre Selbstkosten betragen 295,00 €. Sie kalkulieren mit einem Gewinn von 20 % sowie einem Kundenskonto von 2 % und einem Wiederverkäuferrabatt von 10 %.</w:t>
+            </w:r>
+            <w:r>
               <w:br/>
+            </w:r>
+            <w:r>
               <w:br/>
-              <w:t>Berechnen Sie den Verkaufspreis für einen Besprechungstisch im nachfolgenden Schema. Füllen Sie zudem die Lücken in der linken Spalte korrekt aus.</w:t>
+              <w:t xml:space="preserve">Berechnen Sie den Verkaufspreis für einen Besprechungstisch im nachfolgenden Schema. Füllen Sie zudem die Lücken in der </w:t>
+            </w:r>
+            <w:r>
+              <w:lastRenderedPageBreak/>
+              <w:t>linken Spalte korrekt aus.</w:t>
+            </w:r>
+            <w:r>
               <w:tab/>
               <w:t>16</w:t>
+            </w:r>
+            <w:r>
               <w:br/>
+            </w:r>
+            <w:r>
               <w:br/>
+            </w:r>
+            <w:r>
               <w:br/>
               <w:t>Platz für Kalkulationen</w:t>
+            </w:r>
+            <w:r>
               <w:br/>
+            </w:r>
+            <w:r>
               <w:br/>
             </w:r>
           </w:p>
@@ -913,6 +937,7 @@
           </w:tcPr>
           <w:p>
             <w:r>
+              <w:lastRenderedPageBreak/>
               <w:t>Lösungsmöglichkeit/Hinweis (optional)</w:t>
             </w:r>
           </w:p>
@@ -997,7 +1022,7 @@
       <w:tr>
         <w:tc>
           <w:tcPr>
-            <w:tcW w:type="dxa" w:w="4320"/>
+            <w:tcW w:w="4320" w:type="dxa"/>
           </w:tcPr>
           <w:p>
             <w:r>
@@ -1007,17 +1032,15 @@
         </w:tc>
         <w:tc>
           <w:tcPr>
-            <w:tcW w:type="dxa" w:w="4320"/>
-          </w:tcPr>
-          <w:p>
-            <w:r/>
-          </w:p>
+            <w:tcW w:w="4320" w:type="dxa"/>
+          </w:tcPr>
+          <w:p/>
         </w:tc>
       </w:tr>
       <w:tr>
         <w:tc>
           <w:tcPr>
-            <w:tcW w:type="dxa" w:w="4320"/>
+            <w:tcW w:w="4320" w:type="dxa"/>
           </w:tcPr>
           <w:p>
             <w:r>
@@ -1027,7 +1050,7 @@
         </w:tc>
         <w:tc>
           <w:tcPr>
-            <w:tcW w:type="dxa" w:w="4320"/>
+            <w:tcW w:w="4320" w:type="dxa"/>
           </w:tcPr>
           <w:p>
             <w:r>
@@ -1091,7 +1114,7 @@
                 <w:rFonts w:asciiTheme="minorHAnsi" w:hAnsiTheme="minorHAnsi"/>
                 <w:lang w:val="en-US"/>
               </w:rPr>
-              <w:t>A-001</w:t>
+              <w:t>1</w:t>
             </w:r>
             <w:r>
               <w:rPr>
@@ -1140,9 +1163,7 @@
           <w:tcPr>
             <w:tcW w:w="4320" w:type="dxa"/>
           </w:tcPr>
-          <w:p>
-            <w:r/>
-          </w:p>
+          <w:p/>
         </w:tc>
       </w:tr>
       <w:tr>
@@ -1163,19 +1184,39 @@
           <w:p>
             <w:r>
               <w:t>Am 03. März 20xx bittet Sie die Böhmer AG per E-Mail um ein Angebot über 20 Besprechungstische der neuen Produktlinie 'FancyCarbon'. Sie kalkulieren mit einem Listenverkaufspreis von 400,00 €. Am 06. März 20xx wurde das Angebot für die Böhmer AG über 20 Besprechungstische der neuen Produktlinie versendet.</w:t>
+            </w:r>
+            <w:r>
               <w:br/>
+            </w:r>
+            <w:r>
               <w:br/>
               <w:t>Am 10. März 20xx erhalten Sie die Bestellung der Böhmer AG.</w:t>
+            </w:r>
+            <w:r>
               <w:br/>
+            </w:r>
+            <w:r>
               <w:br/>
               <w:t>Erst als Sie die Bestellung bearbeiten, fällt Ihnen auf, dass der Listenverkaufspreis anstelle von 400,00 € mit 350,00 € angegeben ist. Dies ist bei der Erstellung des Angebots nicht bemerkt worden.</w:t>
+            </w:r>
+            <w:r>
               <w:br/>
+            </w:r>
+            <w:r>
               <w:br/>
               <w:t>Ist durch das Angebot und die Bestellung ein Kaufvertrag zu Stande gekommen? Geben Sie die zutreffende Begründung an.</w:t>
+            </w:r>
+            <w:r>
               <w:tab/>
               <w:t>2</w:t>
+            </w:r>
+            <w:r>
               <w:br/>
+            </w:r>
+            <w:r>
               <w:br/>
+            </w:r>
+            <w:r>
               <w:br/>
             </w:r>
           </w:p>
@@ -1196,9 +1237,7 @@
           <w:tcPr>
             <w:tcW w:w="4320" w:type="dxa"/>
           </w:tcPr>
-          <w:p>
-            <w:r/>
-          </w:p>
+          <w:p/>
         </w:tc>
       </w:tr>
       <w:tr>
@@ -1216,9 +1255,7 @@
           <w:tcPr>
             <w:tcW w:w="4320" w:type="dxa"/>
           </w:tcPr>
-          <w:p>
-            <w:r/>
-          </w:p>
+          <w:p/>
         </w:tc>
       </w:tr>
       <w:tr>
@@ -1268,27 +1305,26 @@
       <w:tr>
         <w:tc>
           <w:tcPr>
-            <w:tcW w:type="dxa" w:w="4320"/>
-          </w:tcPr>
-          <w:p>
-            <w:r>
+            <w:tcW w:w="4320" w:type="dxa"/>
+          </w:tcPr>
+          <w:p>
+            <w:r>
+              <w:lastRenderedPageBreak/>
               <w:t>Quelle/Kommentar (optional)</w:t>
             </w:r>
           </w:p>
         </w:tc>
         <w:tc>
           <w:tcPr>
-            <w:tcW w:type="dxa" w:w="4320"/>
-          </w:tcPr>
-          <w:p>
-            <w:r/>
-          </w:p>
+            <w:tcW w:w="4320" w:type="dxa"/>
+          </w:tcPr>
+          <w:p/>
         </w:tc>
       </w:tr>
       <w:tr>
         <w:tc>
           <w:tcPr>
-            <w:tcW w:type="dxa" w:w="4320"/>
+            <w:tcW w:w="4320" w:type="dxa"/>
           </w:tcPr>
           <w:p>
             <w:r>
@@ -1298,7 +1334,7 @@
         </w:tc>
         <w:tc>
           <w:tcPr>
-            <w:tcW w:type="dxa" w:w="4320"/>
+            <w:tcW w:w="4320" w:type="dxa"/>
           </w:tcPr>
           <w:p>
             <w:r>
@@ -1362,7 +1398,7 @@
                 <w:rFonts w:asciiTheme="minorHAnsi" w:hAnsiTheme="minorHAnsi"/>
                 <w:lang w:val="en-US"/>
               </w:rPr>
-              <w:t>A-001</w:t>
+              <w:t>1</w:t>
             </w:r>
             <w:r>
               <w:rPr>
@@ -1411,9 +1447,7 @@
           <w:tcPr>
             <w:tcW w:w="4320" w:type="dxa"/>
           </w:tcPr>
-          <w:p>
-            <w:r/>
-          </w:p>
+          <w:p/>
         </w:tc>
       </w:tr>
       <w:tr>
@@ -1434,10 +1468,18 @@
           <w:p>
             <w:r>
               <w:t>Welche rechtliche Möglichkeit hat die INN-Büro GmbH, das Problem zu lösen?</w:t>
+            </w:r>
+            <w:r>
               <w:tab/>
               <w:t>2</w:t>
+            </w:r>
+            <w:r>
               <w:br/>
+            </w:r>
+            <w:r>
               <w:br/>
+            </w:r>
+            <w:r>
               <w:br/>
             </w:r>
           </w:p>
@@ -1458,9 +1500,7 @@
           <w:tcPr>
             <w:tcW w:w="4320" w:type="dxa"/>
           </w:tcPr>
-          <w:p>
-            <w:r/>
-          </w:p>
+          <w:p/>
         </w:tc>
       </w:tr>
       <w:tr>
@@ -1478,9 +1518,7 @@
           <w:tcPr>
             <w:tcW w:w="4320" w:type="dxa"/>
           </w:tcPr>
-          <w:p>
-            <w:r/>
-          </w:p>
+          <w:p/>
         </w:tc>
       </w:tr>
       <w:tr>
@@ -1530,7 +1568,7 @@
       <w:tr>
         <w:tc>
           <w:tcPr>
-            <w:tcW w:type="dxa" w:w="4320"/>
+            <w:tcW w:w="4320" w:type="dxa"/>
           </w:tcPr>
           <w:p>
             <w:r>
@@ -1540,17 +1578,15 @@
         </w:tc>
         <w:tc>
           <w:tcPr>
-            <w:tcW w:type="dxa" w:w="4320"/>
-          </w:tcPr>
-          <w:p>
-            <w:r/>
-          </w:p>
+            <w:tcW w:w="4320" w:type="dxa"/>
+          </w:tcPr>
+          <w:p/>
         </w:tc>
       </w:tr>
       <w:tr>
         <w:tc>
           <w:tcPr>
-            <w:tcW w:type="dxa" w:w="4320"/>
+            <w:tcW w:w="4320" w:type="dxa"/>
           </w:tcPr>
           <w:p>
             <w:r>
@@ -1560,7 +1596,7 @@
         </w:tc>
         <w:tc>
           <w:tcPr>
-            <w:tcW w:type="dxa" w:w="4320"/>
+            <w:tcW w:w="4320" w:type="dxa"/>
           </w:tcPr>
           <w:p>
             <w:r>
@@ -1624,14 +1660,7 @@
                 <w:rFonts w:asciiTheme="minorHAnsi" w:hAnsiTheme="minorHAnsi"/>
                 <w:lang w:val="en-US"/>
               </w:rPr>
-              <w:t>A-00</w:t>
-            </w:r>
-            <w:r>
-              <w:rPr>
-                <w:rFonts w:asciiTheme="minorHAnsi" w:hAnsiTheme="minorHAnsi"/>
-                <w:lang w:val="en-US"/>
-              </w:rPr>
-              <w:t>2</w:t>
+              <w:t>2.0</w:t>
             </w:r>
           </w:p>
         </w:tc>
@@ -1676,8 +1705,12 @@
           <w:p>
             <w:r>
               <w:t>Vertragswesen</w:t>
+            </w:r>
+            <w:r>
               <w:br/>
               <w:t xml:space="preserve">Sie sollen für die INN-Büro GmbH ein Informationsblatt zum Thema Gültigkeit von Kaufverträgen erstellen. Sie haben Beispiele zusammengetragen und überprüfen diese. </w:t>
+            </w:r>
+            <w:r>
               <w:br/>
             </w:r>
           </w:p>
@@ -1701,12 +1734,22 @@
           <w:p>
             <w:r>
               <w:t>Ordnen Sie zu, indem die Kennziffern der rechtlichen Bedeutungen in die Kästchen neben den zutreffenden Beispielen eintragen.</w:t>
+            </w:r>
+            <w:r>
               <w:tab/>
               <w:t>6</w:t>
+            </w:r>
+            <w:r>
               <w:br/>
+            </w:r>
+            <w:r>
               <w:br/>
+            </w:r>
+            <w:r>
               <w:br/>
               <w:t>1 – Der Vertrag ist anfechtbar; 2 – Der Vertrag ist nichtig; 3 – Der Vertrag ist gültig.</w:t>
+            </w:r>
+            <w:r>
               <w:br/>
             </w:r>
           </w:p>
@@ -1727,9 +1770,7 @@
           <w:tcPr>
             <w:tcW w:w="4320" w:type="dxa"/>
           </w:tcPr>
-          <w:p>
-            <w:r/>
-          </w:p>
+          <w:p/>
         </w:tc>
       </w:tr>
       <w:tr>
@@ -1801,7 +1842,7 @@
       <w:tr>
         <w:tc>
           <w:tcPr>
-            <w:tcW w:type="dxa" w:w="4320"/>
+            <w:tcW w:w="4320" w:type="dxa"/>
           </w:tcPr>
           <w:p>
             <w:r>
@@ -1811,17 +1852,15 @@
         </w:tc>
         <w:tc>
           <w:tcPr>
-            <w:tcW w:type="dxa" w:w="4320"/>
-          </w:tcPr>
-          <w:p>
-            <w:r/>
-          </w:p>
+            <w:tcW w:w="4320" w:type="dxa"/>
+          </w:tcPr>
+          <w:p/>
         </w:tc>
       </w:tr>
       <w:tr>
         <w:tc>
           <w:tcPr>
-            <w:tcW w:type="dxa" w:w="4320"/>
+            <w:tcW w:w="4320" w:type="dxa"/>
           </w:tcPr>
           <w:p>
             <w:r>
@@ -1831,7 +1870,7 @@
         </w:tc>
         <w:tc>
           <w:tcPr>
-            <w:tcW w:type="dxa" w:w="4320"/>
+            <w:tcW w:w="4320" w:type="dxa"/>
           </w:tcPr>
           <w:p>
             <w:r>
@@ -1874,6 +1913,7 @@
                 <w:rFonts w:asciiTheme="minorHAnsi" w:hAnsiTheme="minorHAnsi"/>
                 <w:lang w:val="en-US"/>
               </w:rPr>
+              <w:lastRenderedPageBreak/>
               <w:t>ID</w:t>
             </w:r>
           </w:p>
@@ -1895,14 +1935,7 @@
                 <w:rFonts w:asciiTheme="minorHAnsi" w:hAnsiTheme="minorHAnsi"/>
                 <w:lang w:val="en-US"/>
               </w:rPr>
-              <w:t>A-00</w:t>
-            </w:r>
-            <w:r>
-              <w:rPr>
-                <w:rFonts w:asciiTheme="minorHAnsi" w:hAnsiTheme="minorHAnsi"/>
-                <w:lang w:val="en-US"/>
-              </w:rPr>
-              <w:t>3</w:t>
+              <w:t>3.0</w:t>
             </w:r>
           </w:p>
         </w:tc>
@@ -1947,6 +1980,8 @@
           <w:p>
             <w:r>
               <w:t>Vertragswesen</w:t>
+            </w:r>
+            <w:r>
               <w:br/>
               <w:t>Erläutern Sie in eigenen Worten den Eigentumsvorbehalt. Unterscheiden Sie anschließend zwischen dem einfachen, dem erweiterten und dem verlängerten Eigentumsvorbehalt.</w:t>
             </w:r>
@@ -1971,10 +2006,18 @@
           <w:p>
             <w:r>
               <w:t>Schreiben Sie in ganzen Sätzen, nicht stichwortartig.</w:t>
+            </w:r>
+            <w:r>
               <w:tab/>
               <w:t>10</w:t>
+            </w:r>
+            <w:r>
               <w:br/>
+            </w:r>
+            <w:r>
               <w:br/>
+            </w:r>
+            <w:r>
               <w:br/>
             </w:r>
           </w:p>
@@ -1995,9 +2038,7 @@
           <w:tcPr>
             <w:tcW w:w="4320" w:type="dxa"/>
           </w:tcPr>
-          <w:p>
-            <w:r/>
-          </w:p>
+          <w:p/>
         </w:tc>
       </w:tr>
       <w:tr>
@@ -2015,9 +2056,7 @@
           <w:tcPr>
             <w:tcW w:w="4320" w:type="dxa"/>
           </w:tcPr>
-          <w:p>
-            <w:r/>
-          </w:p>
+          <w:p/>
         </w:tc>
       </w:tr>
       <w:tr>
@@ -2067,7 +2106,7 @@
       <w:tr>
         <w:tc>
           <w:tcPr>
-            <w:tcW w:type="dxa" w:w="4320"/>
+            <w:tcW w:w="4320" w:type="dxa"/>
           </w:tcPr>
           <w:p>
             <w:r>
@@ -2077,17 +2116,15 @@
         </w:tc>
         <w:tc>
           <w:tcPr>
-            <w:tcW w:type="dxa" w:w="5181"/>
-          </w:tcPr>
-          <w:p>
-            <w:r/>
-          </w:p>
+            <w:tcW w:w="5181" w:type="dxa"/>
+          </w:tcPr>
+          <w:p/>
         </w:tc>
       </w:tr>
       <w:tr>
         <w:tc>
           <w:tcPr>
-            <w:tcW w:type="dxa" w:w="4320"/>
+            <w:tcW w:w="4320" w:type="dxa"/>
           </w:tcPr>
           <w:p>
             <w:r>
@@ -2097,7 +2134,7 @@
         </w:tc>
         <w:tc>
           <w:tcPr>
-            <w:tcW w:type="dxa" w:w="5181"/>
+            <w:tcW w:w="5181" w:type="dxa"/>
           </w:tcPr>
           <w:p>
             <w:r>
@@ -2163,14 +2200,7 @@
                 <w:rFonts w:asciiTheme="minorHAnsi" w:hAnsiTheme="minorHAnsi"/>
                 <w:lang w:val="en-US"/>
               </w:rPr>
-              <w:t>A-00</w:t>
-            </w:r>
-            <w:r>
-              <w:rPr>
-                <w:rFonts w:asciiTheme="minorHAnsi" w:hAnsiTheme="minorHAnsi"/>
-                <w:lang w:val="en-US"/>
-              </w:rPr>
-              <w:t>4</w:t>
+              <w:t>4.0</w:t>
             </w:r>
           </w:p>
         </w:tc>
@@ -2215,10 +2245,18 @@
           <w:p>
             <w:r>
               <w:t>Auftragsbearbeitung</w:t>
+            </w:r>
+            <w:r>
               <w:br/>
               <w:t>Die INN-Büro GmbH hat Bürostühle des Modells Ergorelax 160 an die Livingston GmbH verkauft. Den Auftragsvorgang können Sie der folgenden Übersicht entnehmen.</w:t>
+            </w:r>
+            <w:r>
               <w:br/>
+            </w:r>
+            <w:r>
               <w:br/>
+            </w:r>
+            <w:r>
               <w:br/>
             </w:r>
           </w:p>
@@ -2242,10 +2280,18 @@
           <w:p>
             <w:r>
               <w:t>Welche rechtliche Bedeutung hat die Bestellung der Livingston GmbH für das Zustandekommen des Kaufvertrages?</w:t>
+            </w:r>
+            <w:r>
               <w:tab/>
               <w:t>2</w:t>
+            </w:r>
+            <w:r>
               <w:br/>
+            </w:r>
+            <w:r>
               <w:br/>
+            </w:r>
+            <w:r>
               <w:br/>
             </w:r>
           </w:p>
@@ -2266,9 +2312,7 @@
           <w:tcPr>
             <w:tcW w:w="4320" w:type="dxa"/>
           </w:tcPr>
-          <w:p>
-            <w:r/>
-          </w:p>
+          <w:p/>
         </w:tc>
       </w:tr>
       <w:tr>
@@ -2286,9 +2330,7 @@
           <w:tcPr>
             <w:tcW w:w="4320" w:type="dxa"/>
           </w:tcPr>
-          <w:p>
-            <w:r/>
-          </w:p>
+          <w:p/>
         </w:tc>
       </w:tr>
       <w:tr>
@@ -2338,7 +2380,7 @@
       <w:tr>
         <w:tc>
           <w:tcPr>
-            <w:tcW w:type="dxa" w:w="4320"/>
+            <w:tcW w:w="4320" w:type="dxa"/>
           </w:tcPr>
           <w:p>
             <w:r>
@@ -2348,17 +2390,15 @@
         </w:tc>
         <w:tc>
           <w:tcPr>
-            <w:tcW w:type="dxa" w:w="4320"/>
-          </w:tcPr>
-          <w:p>
-            <w:r/>
-          </w:p>
+            <w:tcW w:w="4320" w:type="dxa"/>
+          </w:tcPr>
+          <w:p/>
         </w:tc>
       </w:tr>
       <w:tr>
         <w:tc>
           <w:tcPr>
-            <w:tcW w:type="dxa" w:w="4320"/>
+            <w:tcW w:w="4320" w:type="dxa"/>
           </w:tcPr>
           <w:p>
             <w:r>
@@ -2368,7 +2408,7 @@
         </w:tc>
         <w:tc>
           <w:tcPr>
-            <w:tcW w:type="dxa" w:w="4320"/>
+            <w:tcW w:w="4320" w:type="dxa"/>
           </w:tcPr>
           <w:p>
             <w:r>
@@ -2434,14 +2474,14 @@
                 <w:rFonts w:asciiTheme="minorHAnsi" w:hAnsiTheme="minorHAnsi"/>
                 <w:lang w:val="en-US"/>
               </w:rPr>
-              <w:t>A-00</w:t>
+              <w:t>4</w:t>
             </w:r>
             <w:r>
               <w:rPr>
                 <w:rFonts w:asciiTheme="minorHAnsi" w:hAnsiTheme="minorHAnsi"/>
                 <w:lang w:val="en-US"/>
               </w:rPr>
-              <w:t>4.1</w:t>
+              <w:t>.1</w:t>
             </w:r>
           </w:p>
         </w:tc>
@@ -2453,6 +2493,7 @@
           </w:tcPr>
           <w:p>
             <w:r>
+              <w:lastRenderedPageBreak/>
               <w:t>Titel</w:t>
             </w:r>
           </w:p>
@@ -2483,9 +2524,7 @@
           <w:tcPr>
             <w:tcW w:w="4320" w:type="dxa"/>
           </w:tcPr>
-          <w:p>
-            <w:r/>
-          </w:p>
+          <w:p/>
         </w:tc>
       </w:tr>
       <w:tr>
@@ -2506,10 +2545,18 @@
           <w:p>
             <w:r>
               <w:t>Geben Sie an, zu welchem Zeitpunkt der Kaufvertrag zustande gekommen ist. Tragen Sie das Datum im Format TT.MM.20xx ein.</w:t>
+            </w:r>
+            <w:r>
               <w:tab/>
               <w:t>4</w:t>
+            </w:r>
+            <w:r>
               <w:br/>
+            </w:r>
+            <w:r>
               <w:br/>
+            </w:r>
+            <w:r>
               <w:br/>
             </w:r>
           </w:p>
@@ -2530,9 +2577,7 @@
           <w:tcPr>
             <w:tcW w:w="4320" w:type="dxa"/>
           </w:tcPr>
-          <w:p>
-            <w:r/>
-          </w:p>
+          <w:p/>
         </w:tc>
       </w:tr>
       <w:tr>
@@ -2550,9 +2595,7 @@
           <w:tcPr>
             <w:tcW w:w="4320" w:type="dxa"/>
           </w:tcPr>
-          <w:p>
-            <w:r/>
-          </w:p>
+          <w:p/>
         </w:tc>
       </w:tr>
       <w:tr>
@@ -2602,7 +2645,7 @@
       <w:tr>
         <w:tc>
           <w:tcPr>
-            <w:tcW w:type="dxa" w:w="4320"/>
+            <w:tcW w:w="4320" w:type="dxa"/>
           </w:tcPr>
           <w:p>
             <w:r>
@@ -2612,17 +2655,15 @@
         </w:tc>
         <w:tc>
           <w:tcPr>
-            <w:tcW w:type="dxa" w:w="4320"/>
-          </w:tcPr>
-          <w:p>
-            <w:r/>
-          </w:p>
+            <w:tcW w:w="4320" w:type="dxa"/>
+          </w:tcPr>
+          <w:p/>
         </w:tc>
       </w:tr>
       <w:tr>
         <w:tc>
           <w:tcPr>
-            <w:tcW w:type="dxa" w:w="4320"/>
+            <w:tcW w:w="4320" w:type="dxa"/>
           </w:tcPr>
           <w:p>
             <w:r>
@@ -2632,7 +2673,7 @@
         </w:tc>
         <w:tc>
           <w:tcPr>
-            <w:tcW w:type="dxa" w:w="4320"/>
+            <w:tcW w:w="4320" w:type="dxa"/>
           </w:tcPr>
           <w:p>
             <w:r>
@@ -2696,14 +2737,14 @@
                 <w:rFonts w:asciiTheme="minorHAnsi" w:hAnsiTheme="minorHAnsi"/>
                 <w:lang w:val="en-US"/>
               </w:rPr>
-              <w:t>A-00</w:t>
+              <w:t>4</w:t>
             </w:r>
             <w:r>
               <w:rPr>
                 <w:rFonts w:asciiTheme="minorHAnsi" w:hAnsiTheme="minorHAnsi"/>
                 <w:lang w:val="en-US"/>
               </w:rPr>
-              <w:t>4.2</w:t>
+              <w:t>.2</w:t>
             </w:r>
           </w:p>
         </w:tc>
@@ -2745,9 +2786,7 @@
           <w:tcPr>
             <w:tcW w:w="4320" w:type="dxa"/>
           </w:tcPr>
-          <w:p>
-            <w:r/>
-          </w:p>
+          <w:p/>
         </w:tc>
       </w:tr>
       <w:tr>
@@ -2768,10 +2807,18 @@
           <w:p>
             <w:r>
               <w:t>Das Angebot der INN-Büro GmbH in der Fachzeitschrift beinhaltete keine Angaben zu den Versandkosten. Mit welcher Klausel wird die gesetzliche Regelung beim Versendungskauf richtig beschrieben?</w:t>
+            </w:r>
+            <w:r>
               <w:tab/>
               <w:t>2</w:t>
+            </w:r>
+            <w:r>
               <w:br/>
+            </w:r>
+            <w:r>
               <w:br/>
+            </w:r>
+            <w:r>
               <w:br/>
             </w:r>
           </w:p>
@@ -2792,9 +2839,7 @@
           <w:tcPr>
             <w:tcW w:w="4320" w:type="dxa"/>
           </w:tcPr>
-          <w:p>
-            <w:r/>
-          </w:p>
+          <w:p/>
         </w:tc>
       </w:tr>
       <w:tr>
@@ -2812,9 +2857,7 @@
           <w:tcPr>
             <w:tcW w:w="4320" w:type="dxa"/>
           </w:tcPr>
-          <w:p>
-            <w:r/>
-          </w:p>
+          <w:p/>
         </w:tc>
       </w:tr>
       <w:tr>
@@ -2864,7 +2907,7 @@
       <w:tr>
         <w:tc>
           <w:tcPr>
-            <w:tcW w:type="dxa" w:w="4320"/>
+            <w:tcW w:w="4320" w:type="dxa"/>
           </w:tcPr>
           <w:p>
             <w:r>
@@ -2874,17 +2917,15 @@
         </w:tc>
         <w:tc>
           <w:tcPr>
-            <w:tcW w:type="dxa" w:w="4320"/>
-          </w:tcPr>
-          <w:p>
-            <w:r/>
-          </w:p>
+            <w:tcW w:w="4320" w:type="dxa"/>
+          </w:tcPr>
+          <w:p/>
         </w:tc>
       </w:tr>
       <w:tr>
         <w:tc>
           <w:tcPr>
-            <w:tcW w:type="dxa" w:w="4320"/>
+            <w:tcW w:w="4320" w:type="dxa"/>
           </w:tcPr>
           <w:p>
             <w:r>
@@ -2894,7 +2935,7 @@
         </w:tc>
         <w:tc>
           <w:tcPr>
-            <w:tcW w:type="dxa" w:w="4320"/>
+            <w:tcW w:w="4320" w:type="dxa"/>
           </w:tcPr>
           <w:p>
             <w:r>
@@ -2936,7 +2977,10 @@
           </w:tcPr>
           <w:p>
             <w:r>
-              <w:t>A-004.3</w:t>
+              <w:t>4</w:t>
+            </w:r>
+            <w:r>
+              <w:t>.3</w:t>
             </w:r>
           </w:p>
         </w:tc>
@@ -2978,9 +3022,7 @@
           <w:tcPr>
             <w:tcW w:w="4320" w:type="dxa"/>
           </w:tcPr>
-          <w:p>
-            <w:r/>
-          </w:p>
+          <w:p/>
         </w:tc>
       </w:tr>
       <w:tr>
@@ -3001,10 +3043,19 @@
           <w:p>
             <w:r>
               <w:t>Erläutern Sie einen Vorteil für die INN-Büro GmbH, der durch die Gewährung von Skonto erreicht werden soll.</w:t>
+            </w:r>
+            <w:r>
               <w:tab/>
               <w:t>4</w:t>
+            </w:r>
+            <w:r>
               <w:br/>
+            </w:r>
+            <w:r>
               <w:br/>
+            </w:r>
+            <w:r>
+              <w:lastRenderedPageBreak/>
               <w:br/>
             </w:r>
           </w:p>
@@ -3017,6 +3068,7 @@
           </w:tcPr>
           <w:p>
             <w:r>
+              <w:lastRenderedPageBreak/>
               <w:t>Lösungsmöglichkeit/Hinweis (optional)</w:t>
             </w:r>
           </w:p>
@@ -3025,9 +3077,7 @@
           <w:tcPr>
             <w:tcW w:w="4320" w:type="dxa"/>
           </w:tcPr>
-          <w:p>
-            <w:r/>
-          </w:p>
+          <w:p/>
         </w:tc>
       </w:tr>
       <w:tr>
@@ -3099,7 +3149,7 @@
       <w:tr>
         <w:tc>
           <w:tcPr>
-            <w:tcW w:type="dxa" w:w="4320"/>
+            <w:tcW w:w="4320" w:type="dxa"/>
           </w:tcPr>
           <w:p>
             <w:r>
@@ -3109,17 +3159,15 @@
         </w:tc>
         <w:tc>
           <w:tcPr>
-            <w:tcW w:type="dxa" w:w="4320"/>
-          </w:tcPr>
-          <w:p>
-            <w:r/>
-          </w:p>
+            <w:tcW w:w="4320" w:type="dxa"/>
+          </w:tcPr>
+          <w:p/>
         </w:tc>
       </w:tr>
       <w:tr>
         <w:tc>
           <w:tcPr>
-            <w:tcW w:type="dxa" w:w="4320"/>
+            <w:tcW w:w="4320" w:type="dxa"/>
           </w:tcPr>
           <w:p>
             <w:r>
@@ -3129,7 +3177,7 @@
         </w:tc>
         <w:tc>
           <w:tcPr>
-            <w:tcW w:type="dxa" w:w="4320"/>
+            <w:tcW w:w="4320" w:type="dxa"/>
           </w:tcPr>
           <w:p>
             <w:r>
@@ -3193,14 +3241,14 @@
                 <w:rFonts w:asciiTheme="minorHAnsi" w:hAnsiTheme="minorHAnsi"/>
                 <w:lang w:val="en-US"/>
               </w:rPr>
-              <w:t>A-00</w:t>
+              <w:t>4</w:t>
             </w:r>
             <w:r>
               <w:rPr>
                 <w:rFonts w:asciiTheme="minorHAnsi" w:hAnsiTheme="minorHAnsi"/>
                 <w:lang w:val="en-US"/>
               </w:rPr>
-              <w:t>4.4</w:t>
+              <w:t>.4</w:t>
             </w:r>
           </w:p>
         </w:tc>
@@ -3242,9 +3290,7 @@
           <w:tcPr>
             <w:tcW w:w="4320" w:type="dxa"/>
           </w:tcPr>
-          <w:p>
-            <w:r/>
-          </w:p>
+          <w:p/>
         </w:tc>
       </w:tr>
       <w:tr>
@@ -3265,10 +3311,18 @@
           <w:p>
             <w:r>
               <w:t>Geben Sie an, zu welchem Zeitpunkt die Livingston GmbH Eigentümerin der Bürostühle geworden ist. Tragen Sie das Datum im Format TT.MM.20xx ein.</w:t>
+            </w:r>
+            <w:r>
               <w:tab/>
               <w:t>4</w:t>
+            </w:r>
+            <w:r>
               <w:br/>
+            </w:r>
+            <w:r>
               <w:br/>
+            </w:r>
+            <w:r>
               <w:br/>
             </w:r>
           </w:p>
@@ -3289,9 +3343,7 @@
           <w:tcPr>
             <w:tcW w:w="4320" w:type="dxa"/>
           </w:tcPr>
-          <w:p>
-            <w:r/>
-          </w:p>
+          <w:p/>
         </w:tc>
       </w:tr>
       <w:tr>
@@ -3309,9 +3361,7 @@
           <w:tcPr>
             <w:tcW w:w="4320" w:type="dxa"/>
           </w:tcPr>
-          <w:p>
-            <w:r/>
-          </w:p>
+          <w:p/>
         </w:tc>
       </w:tr>
       <w:tr>
@@ -3361,7 +3411,7 @@
       <w:tr>
         <w:tc>
           <w:tcPr>
-            <w:tcW w:type="dxa" w:w="4320"/>
+            <w:tcW w:w="4320" w:type="dxa"/>
           </w:tcPr>
           <w:p>
             <w:r>
@@ -3371,17 +3421,15 @@
         </w:tc>
         <w:tc>
           <w:tcPr>
-            <w:tcW w:type="dxa" w:w="4320"/>
-          </w:tcPr>
-          <w:p>
-            <w:r/>
-          </w:p>
+            <w:tcW w:w="4320" w:type="dxa"/>
+          </w:tcPr>
+          <w:p/>
         </w:tc>
       </w:tr>
       <w:tr>
         <w:tc>
           <w:tcPr>
-            <w:tcW w:type="dxa" w:w="4320"/>
+            <w:tcW w:w="4320" w:type="dxa"/>
           </w:tcPr>
           <w:p>
             <w:r>
@@ -3391,7 +3439,7 @@
         </w:tc>
         <w:tc>
           <w:tcPr>
-            <w:tcW w:type="dxa" w:w="4320"/>
+            <w:tcW w:w="4320" w:type="dxa"/>
           </w:tcPr>
           <w:p>
             <w:r>
@@ -3455,14 +3503,14 @@
                 <w:rFonts w:asciiTheme="minorHAnsi" w:hAnsiTheme="minorHAnsi"/>
                 <w:lang w:val="en-US"/>
               </w:rPr>
-              <w:t>A-00</w:t>
+              <w:t>4</w:t>
             </w:r>
             <w:r>
               <w:rPr>
                 <w:rFonts w:asciiTheme="minorHAnsi" w:hAnsiTheme="minorHAnsi"/>
                 <w:lang w:val="en-US"/>
               </w:rPr>
-              <w:t>4.5</w:t>
+              <w:t>.5</w:t>
             </w:r>
           </w:p>
         </w:tc>
@@ -3504,9 +3552,7 @@
           <w:tcPr>
             <w:tcW w:w="4320" w:type="dxa"/>
           </w:tcPr>
-          <w:p>
-            <w:r/>
-          </w:p>
+          <w:p/>
         </w:tc>
       </w:tr>
       <w:tr>
@@ -3527,10 +3573,18 @@
           <w:p>
             <w:r>
               <w:t>Die fehlende Zahlung hätte die INN-Büro GmbH notfalls einklagen müssen. Vor welchem Gericht hätte sie klagen müssen, wenn der gesetzliche Gerichtsstand gilt?</w:t>
+            </w:r>
+            <w:r>
               <w:tab/>
               <w:t>2</w:t>
+            </w:r>
+            <w:r>
               <w:br/>
+            </w:r>
+            <w:r>
               <w:br/>
+            </w:r>
+            <w:r>
               <w:br/>
             </w:r>
           </w:p>
@@ -3551,9 +3605,7 @@
           <w:tcPr>
             <w:tcW w:w="4320" w:type="dxa"/>
           </w:tcPr>
-          <w:p>
-            <w:r/>
-          </w:p>
+          <w:p/>
         </w:tc>
       </w:tr>
       <w:tr>
@@ -3571,9 +3623,7 @@
           <w:tcPr>
             <w:tcW w:w="4320" w:type="dxa"/>
           </w:tcPr>
-          <w:p>
-            <w:r/>
-          </w:p>
+          <w:p/>
         </w:tc>
       </w:tr>
       <w:tr>
@@ -3623,7 +3673,7 @@
       <w:tr>
         <w:tc>
           <w:tcPr>
-            <w:tcW w:type="dxa" w:w="4320"/>
+            <w:tcW w:w="4320" w:type="dxa"/>
           </w:tcPr>
           <w:p>
             <w:r>
@@ -3633,27 +3683,26 @@
         </w:tc>
         <w:tc>
           <w:tcPr>
-            <w:tcW w:type="dxa" w:w="4320"/>
-          </w:tcPr>
-          <w:p>
-            <w:r/>
-          </w:p>
+            <w:tcW w:w="4320" w:type="dxa"/>
+          </w:tcPr>
+          <w:p/>
         </w:tc>
       </w:tr>
       <w:tr>
         <w:tc>
           <w:tcPr>
-            <w:tcW w:type="dxa" w:w="4320"/>
-          </w:tcPr>
-          <w:p>
-            <w:r>
+            <w:tcW w:w="4320" w:type="dxa"/>
+          </w:tcPr>
+          <w:p>
+            <w:r>
+              <w:lastRenderedPageBreak/>
               <w:t>Kategorie</w:t>
             </w:r>
           </w:p>
         </w:tc>
         <w:tc>
           <w:tcPr>
-            <w:tcW w:type="dxa" w:w="4320"/>
+            <w:tcW w:w="4320" w:type="dxa"/>
           </w:tcPr>
           <w:p>
             <w:r>
@@ -3717,14 +3766,14 @@
                 <w:rFonts w:asciiTheme="minorHAnsi" w:hAnsiTheme="minorHAnsi"/>
                 <w:lang w:val="en-US"/>
               </w:rPr>
-              <w:t>A-00</w:t>
+              <w:t>4</w:t>
             </w:r>
             <w:r>
               <w:rPr>
                 <w:rFonts w:asciiTheme="minorHAnsi" w:hAnsiTheme="minorHAnsi"/>
                 <w:lang w:val="en-US"/>
               </w:rPr>
-              <w:t>4.6</w:t>
+              <w:t>.6</w:t>
             </w:r>
           </w:p>
         </w:tc>
@@ -3766,9 +3815,7 @@
           <w:tcPr>
             <w:tcW w:w="4320" w:type="dxa"/>
           </w:tcPr>
-          <w:p>
-            <w:r/>
-          </w:p>
+          <w:p/>
         </w:tc>
       </w:tr>
       <w:tr>
@@ -3789,16 +3836,32 @@
           <w:p>
             <w:r>
               <w:t xml:space="preserve">Aufgrund der Mängelrüge der Livingston GmbH werden Sie beauftragt, beim Kunden anzurufen. </w:t>
+            </w:r>
+            <w:r>
               <w:br/>
+            </w:r>
+            <w:r>
               <w:br/>
               <w:t xml:space="preserve">Bei der Kontaktaufnahme stellen Sie fest, dass der Kunde sehr verärgert ist. Wie verhalten Sie sich in dieser Situation kundenorientiert? </w:t>
+            </w:r>
+            <w:r>
               <w:br/>
+            </w:r>
+            <w:r>
               <w:br/>
               <w:t>Geben Sie 3 angemessene Verhaltensweisen an.</w:t>
+            </w:r>
+            <w:r>
               <w:tab/>
               <w:t>6</w:t>
+            </w:r>
+            <w:r>
               <w:br/>
+            </w:r>
+            <w:r>
               <w:br/>
+            </w:r>
+            <w:r>
               <w:br/>
             </w:r>
           </w:p>
@@ -3819,9 +3882,7 @@
           <w:tcPr>
             <w:tcW w:w="4320" w:type="dxa"/>
           </w:tcPr>
-          <w:p>
-            <w:r/>
-          </w:p>
+          <w:p/>
         </w:tc>
       </w:tr>
       <w:tr>
@@ -3839,9 +3900,7 @@
           <w:tcPr>
             <w:tcW w:w="4320" w:type="dxa"/>
           </w:tcPr>
-          <w:p>
-            <w:r/>
-          </w:p>
+          <w:p/>
         </w:tc>
       </w:tr>
       <w:tr>
@@ -3891,7 +3950,7 @@
       <w:tr>
         <w:tc>
           <w:tcPr>
-            <w:tcW w:type="dxa" w:w="4320"/>
+            <w:tcW w:w="4320" w:type="dxa"/>
           </w:tcPr>
           <w:p>
             <w:r>
@@ -3901,17 +3960,15 @@
         </w:tc>
         <w:tc>
           <w:tcPr>
-            <w:tcW w:type="dxa" w:w="5527"/>
-          </w:tcPr>
-          <w:p>
-            <w:r/>
-          </w:p>
+            <w:tcW w:w="5527" w:type="dxa"/>
+          </w:tcPr>
+          <w:p/>
         </w:tc>
       </w:tr>
       <w:tr>
         <w:tc>
           <w:tcPr>
-            <w:tcW w:type="dxa" w:w="4320"/>
+            <w:tcW w:w="4320" w:type="dxa"/>
           </w:tcPr>
           <w:p>
             <w:r>
@@ -3921,7 +3978,7 @@
         </w:tc>
         <w:tc>
           <w:tcPr>
-            <w:tcW w:type="dxa" w:w="5527"/>
+            <w:tcW w:w="5527" w:type="dxa"/>
           </w:tcPr>
           <w:p>
             <w:r>
@@ -3985,14 +4042,7 @@
                 <w:rFonts w:asciiTheme="minorHAnsi" w:hAnsiTheme="minorHAnsi"/>
                 <w:lang w:val="en-US"/>
               </w:rPr>
-              <w:t>A-00</w:t>
-            </w:r>
-            <w:r>
-              <w:rPr>
-                <w:rFonts w:asciiTheme="minorHAnsi" w:hAnsiTheme="minorHAnsi"/>
-                <w:lang w:val="en-US"/>
-              </w:rPr>
-              <w:t>5</w:t>
+              <w:t>5.0</w:t>
             </w:r>
           </w:p>
         </w:tc>
@@ -4037,35 +4087,76 @@
           <w:p>
             <w:r>
               <w:t>Kalkulation Industrie</w:t>
+            </w:r>
+            <w:r>
               <w:br/>
               <w:t>Die INN-Büro GmbH bietet Sonder-Ausgaben ihrer Auswahl hochwertiger Schreibtische an. Ein neuer Kunde, die GoroTech UG, bittet um ein Angebot für den Schreibtisch 'ErgoDesk' in der Variante mit Tischplatte aus Walnuss-Holz, Edelstahl-Rahmen und -Untergestell.</w:t>
+            </w:r>
+            <w:r>
               <w:br/>
+            </w:r>
+            <w:r>
               <w:br/>
               <w:t>Aus der Produktion erhalten Sie die Information, dass die Fertigungszeit 8 Stunden beträgt. Der Fertigungskostensatz liegt 18,50 €/Stunde. Das Fertigungsmaterial wird in der Summe mit 434,00 € veranschlagt.</w:t>
+            </w:r>
+            <w:r>
               <w:br/>
+            </w:r>
+            <w:r>
               <w:br/>
               <w:t>Darüber hinaus stehen Ihnen folgende Informationen zur Verfügung:</w:t>
+            </w:r>
+            <w:r>
               <w:br/>
+            </w:r>
+            <w:r>
               <w:br/>
+            </w:r>
+            <w:r>
+              <w:lastRenderedPageBreak/>
               <w:t>38 % Materialgemeinkostenzuschlagssatz</w:t>
+            </w:r>
+            <w:r>
               <w:br/>
               <w:t>46 % Fertigungsgemeinkostenzuschlagssatz</w:t>
+            </w:r>
+            <w:r>
               <w:br/>
               <w:t>10 % Verwaltungsgemeinkostenzuschlagssatz und</w:t>
+            </w:r>
+            <w:r>
               <w:br/>
               <w:t>18 % Vertriebsgemeinkostenzuschlagssatz.</w:t>
+            </w:r>
+            <w:r>
               <w:br/>
+            </w:r>
+            <w:r>
               <w:br/>
               <w:t>Für die Preiskalkulationen liegen Ihnen folgende Richtwerte vor:</w:t>
+            </w:r>
+            <w:r>
               <w:br/>
+            </w:r>
+            <w:r>
               <w:br/>
               <w:t>Gewinn: 30 %</w:t>
+            </w:r>
+            <w:r>
               <w:br/>
               <w:t>Kundenskonto: 3 %</w:t>
+            </w:r>
+            <w:r>
               <w:br/>
               <w:t>Kundenrabatt: 5 % (für Neukunden)</w:t>
+            </w:r>
+            <w:r>
               <w:br/>
+            </w:r>
+            <w:r>
               <w:br/>
+            </w:r>
+            <w:r>
               <w:br/>
             </w:r>
           </w:p>
@@ -4078,6 +4169,7 @@
           </w:tcPr>
           <w:p>
             <w:r>
+              <w:lastRenderedPageBreak/>
               <w:t>Aufgabenstellung (Pflicht)</w:t>
             </w:r>
           </w:p>
@@ -4089,10 +4181,18 @@
           <w:p>
             <w:r>
               <w:t xml:space="preserve">Berechnen Sie die Selbstkosten für die Sonder-Ausgabe des Schreibtisches 'ErgoDesk' in Walnuss-Holz/Edelstahl sowie den Listenverkaufspreis (netto). </w:t>
+            </w:r>
+            <w:r>
               <w:br/>
+            </w:r>
+            <w:r>
               <w:br/>
+            </w:r>
+            <w:r>
               <w:br/>
               <w:t>Platz für Kalkulationen</w:t>
+            </w:r>
+            <w:r>
               <w:br/>
             </w:r>
           </w:p>
@@ -4113,9 +4213,7 @@
           <w:tcPr>
             <w:tcW w:w="4320" w:type="dxa"/>
           </w:tcPr>
-          <w:p>
-            <w:r/>
-          </w:p>
+          <w:p/>
         </w:tc>
       </w:tr>
       <w:tr>
@@ -4133,9 +4231,7 @@
           <w:tcPr>
             <w:tcW w:w="4320" w:type="dxa"/>
           </w:tcPr>
-          <w:p>
-            <w:r/>
-          </w:p>
+          <w:p/>
         </w:tc>
       </w:tr>
       <w:tr>
@@ -4185,7 +4281,7 @@
       <w:tr>
         <w:tc>
           <w:tcPr>
-            <w:tcW w:type="dxa" w:w="4320"/>
+            <w:tcW w:w="4320" w:type="dxa"/>
           </w:tcPr>
           <w:p>
             <w:r>
@@ -4195,17 +4291,15 @@
         </w:tc>
         <w:tc>
           <w:tcPr>
-            <w:tcW w:type="dxa" w:w="4320"/>
-          </w:tcPr>
-          <w:p>
-            <w:r/>
-          </w:p>
+            <w:tcW w:w="4320" w:type="dxa"/>
+          </w:tcPr>
+          <w:p/>
         </w:tc>
       </w:tr>
       <w:tr>
         <w:tc>
           <w:tcPr>
-            <w:tcW w:type="dxa" w:w="4320"/>
+            <w:tcW w:w="4320" w:type="dxa"/>
           </w:tcPr>
           <w:p>
             <w:r>
@@ -4215,7 +4309,7 @@
         </w:tc>
         <w:tc>
           <w:tcPr>
-            <w:tcW w:type="dxa" w:w="4320"/>
+            <w:tcW w:w="4320" w:type="dxa"/>
           </w:tcPr>
           <w:p>
             <w:r>
@@ -4279,14 +4373,14 @@
                 <w:rFonts w:asciiTheme="minorHAnsi" w:hAnsiTheme="minorHAnsi"/>
                 <w:lang w:val="en-US"/>
               </w:rPr>
-              <w:t>A-00</w:t>
+              <w:t>5</w:t>
             </w:r>
             <w:r>
               <w:rPr>
                 <w:rFonts w:asciiTheme="minorHAnsi" w:hAnsiTheme="minorHAnsi"/>
                 <w:lang w:val="en-US"/>
               </w:rPr>
-              <w:t>5.1</w:t>
+              <w:t>.1</w:t>
             </w:r>
           </w:p>
         </w:tc>
@@ -4328,9 +4422,7 @@
           <w:tcPr>
             <w:tcW w:w="4320" w:type="dxa"/>
           </w:tcPr>
-          <w:p>
-            <w:r/>
-          </w:p>
+          <w:p/>
         </w:tc>
       </w:tr>
       <w:tr>
@@ -4351,10 +4443,18 @@
           <w:p>
             <w:r>
               <w:t>Welcher Preis kann für diese Variante des Schreibtisches 'ErgoDesk' als langfristige Preisuntergrenze angesetzt werden?</w:t>
+            </w:r>
+            <w:r>
               <w:tab/>
               <w:t>4</w:t>
+            </w:r>
+            <w:r>
               <w:br/>
+            </w:r>
+            <w:r>
               <w:br/>
+            </w:r>
+            <w:r>
               <w:br/>
             </w:r>
           </w:p>
@@ -4375,9 +4475,7 @@
           <w:tcPr>
             <w:tcW w:w="4320" w:type="dxa"/>
           </w:tcPr>
-          <w:p>
-            <w:r/>
-          </w:p>
+          <w:p/>
         </w:tc>
       </w:tr>
       <w:tr>
@@ -4395,9 +4493,7 @@
           <w:tcPr>
             <w:tcW w:w="4320" w:type="dxa"/>
           </w:tcPr>
-          <w:p>
-            <w:r/>
-          </w:p>
+          <w:p/>
         </w:tc>
       </w:tr>
       <w:tr>
@@ -4447,7 +4543,7 @@
       <w:tr>
         <w:tc>
           <w:tcPr>
-            <w:tcW w:type="dxa" w:w="4320"/>
+            <w:tcW w:w="4320" w:type="dxa"/>
           </w:tcPr>
           <w:p>
             <w:r>
@@ -4457,27 +4553,26 @@
         </w:tc>
         <w:tc>
           <w:tcPr>
-            <w:tcW w:type="dxa" w:w="4320"/>
-          </w:tcPr>
-          <w:p>
-            <w:r/>
-          </w:p>
+            <w:tcW w:w="4320" w:type="dxa"/>
+          </w:tcPr>
+          <w:p/>
         </w:tc>
       </w:tr>
       <w:tr>
         <w:tc>
           <w:tcPr>
-            <w:tcW w:type="dxa" w:w="4320"/>
-          </w:tcPr>
-          <w:p>
-            <w:r>
+            <w:tcW w:w="4320" w:type="dxa"/>
+          </w:tcPr>
+          <w:p>
+            <w:r>
+              <w:lastRenderedPageBreak/>
               <w:t>Kategorie</w:t>
             </w:r>
           </w:p>
         </w:tc>
         <w:tc>
           <w:tcPr>
-            <w:tcW w:type="dxa" w:w="4320"/>
+            <w:tcW w:w="4320" w:type="dxa"/>
           </w:tcPr>
           <w:p>
             <w:r>
@@ -4492,8 +4587,8 @@
         <w:spacing w:after="160"/>
       </w:pPr>
     </w:p>
+    <w:bookmarkEnd w:id="0"/>
     <w:bookmarkEnd w:id="1"/>
-    <w:bookmarkEnd w:id="2"/>
     <w:p/>
     <w:sectPr>
       <w:pgSz w:w="12240" w:h="15840"/>

</xml_diff>

<commit_message>
Release 3.7.0 update: GUI version-title fallback, docs sync, build artifacts
</commit_message>
<xml_diff>
--- a/data/Aufgaben/Aufgaben_Auftragssteuerung und -koordination.docx
+++ b/data/Aufgaben/Aufgaben_Auftragssteuerung und -koordination.docx
@@ -18,12 +18,12 @@
     <w:tbl>
       <w:tblPr>
         <w:tblStyle w:val="Tabellenraster"/>
-        <w:tblW w:w="0" w:type="auto"/>
+        <w:tblW w:w="5000" w:type="pct"/>
         <w:tblLook w:val="04A0" w:firstRow="1" w:lastRow="0" w:firstColumn="1" w:lastColumn="0" w:noHBand="0" w:noVBand="1"/>
       </w:tblPr>
       <w:tblGrid>
-        <w:gridCol w:w="4320"/>
-        <w:gridCol w:w="4320"/>
+        <w:gridCol w:w="5093"/>
+        <w:gridCol w:w="5094"/>
       </w:tblGrid>
       <w:tr>
         <w:tc>
@@ -64,7 +64,7 @@
           </w:tcPr>
           <w:p>
             <w:r>
-              <w:t>Sie bereiten sich auf das Treffen vor. Formulie...</w:t>
+              <w:t>Verkauf und Kundenberatung</w:t>
             </w:r>
           </w:p>
         </w:tc>
@@ -86,14 +86,15 @@
           </w:tcPr>
           <w:p>
             <w:r>
-              <w:t>Auftragsbearbeitung I</w:t>
-            </w:r>
-            <w:r>
-              <w:br/>
-              <w:t>Die INN-Büro GmbH hat für die neue Produktlinie 'FancyCarbon' geworben. Die Böhmer AG, ein langjähriger Kunde der INN-Büro GmbH, hat aus Norwegen Anfragen zu solchen Produkten erhalten. Einige große Industrieunternehmen benötigen Ausstattungen für Besprechungsräume in edlem Design. Um die INN-Design AG genauer über diese Produkte zu informieren, lädt die INN-Büro GmbH Mitarbeiter aus dem Einkauf und Vertrieb in ihr Unternehmen ein. Sie sind als Mitarbeitende im Verkauf bei diesem Treffen dabei.</w:t>
-            </w:r>
-            <w:r>
-              <w:br/>
+              <w:t>Die INN-Büro GmbH hat für die neue Produktlinie '</w:t>
+            </w:r>
+            <w:proofErr w:type="spellStart"/>
+            <w:r>
+              <w:t>FancyCarbon</w:t>
+            </w:r>
+            <w:proofErr w:type="spellEnd"/>
+            <w:r>
+              <w:t>' geworben. Die Böhmer AG, ein langjähriger Kunde der INN-Büro GmbH, hat aus Norwegen Anfragen zu solchen Produkten erhalten. Einige große Industrieunternehmen benötigen Ausstattungen für Besprechungsräume in edlem Design. Um die INN-Design AG genauer über diese Produkte zu informieren, lädt die INN-Büro GmbH Mitarbeiter aus dem Einkauf und Vertrieb in ihr Unternehmen ein. Sie sind als Mitarbeitende im Verkauf bei diesem Treffen dabei.</w:t>
             </w:r>
           </w:p>
         </w:tc>
@@ -117,20 +118,37 @@
             <w:r>
               <w:t>Sie bereiten sich auf das Treffen vor. Formulieren Sie vier Fragen, die Ihnen Mitarbeitende der Böhmer AG zur neuen Produktlinie stellen könnten.</w:t>
             </w:r>
-            <w:r>
-              <w:tab/>
-              <w:t>8</w:t>
-            </w:r>
-            <w:r>
-              <w:br/>
-            </w:r>
-            <w:r>
-              <w:br/>
-            </w:r>
-            <w:r>
-              <w:br/>
-            </w:r>
-          </w:p>
+          </w:p>
+          <w:p/>
+          <w:tbl>
+            <w:tblPr>
+              <w:tblStyle w:val="Tabellenraster"/>
+              <w:tblW w:w="0" w:type="auto"/>
+              <w:tblLook w:val="04A0" w:firstRow="1" w:lastRow="0" w:firstColumn="1" w:lastColumn="0" w:noHBand="0" w:noVBand="1"/>
+            </w:tblPr>
+            <w:tblGrid>
+              <w:gridCol w:w="4089"/>
+            </w:tblGrid>
+            <w:tr>
+              <w:trPr>
+                <w:trHeight w:val="1417"/>
+              </w:trPr>
+              <w:tc>
+                <w:tcPr>
+                  <w:tcW w:w="4089" w:type="dxa"/>
+                  <w:tcBorders>
+                    <w:top w:val="nil"/>
+                    <w:left w:val="nil"/>
+                    <w:bottom w:val="single" w:sz="4" w:space="0" w:color="auto"/>
+                    <w:right w:val="nil"/>
+                  </w:tcBorders>
+                  <w:shd w:val="clear" w:color="auto" w:fill="FDE9D9" w:themeFill="accent6" w:themeFillTint="33"/>
+                </w:tcPr>
+                <w:p/>
+              </w:tc>
+            </w:tr>
+          </w:tbl>
+          <w:p/>
         </w:tc>
       </w:tr>
       <w:tr>
@@ -252,7 +270,7 @@
           </w:tcPr>
           <w:p>
             <w:r>
-              <w:t>Auftragssteuerung und -koordination</w:t>
+              <w:t>Auftragsbearbeitung</w:t>
             </w:r>
           </w:p>
         </w:tc>
@@ -262,12 +280,12 @@
     <w:tbl>
       <w:tblPr>
         <w:tblStyle w:val="Tabellenraster"/>
-        <w:tblW w:w="0" w:type="auto"/>
+        <w:tblW w:w="5000" w:type="pct"/>
         <w:tblLook w:val="04A0" w:firstRow="1" w:lastRow="0" w:firstColumn="1" w:lastColumn="0" w:noHBand="0" w:noVBand="1"/>
       </w:tblPr>
       <w:tblGrid>
-        <w:gridCol w:w="4320"/>
-        <w:gridCol w:w="4320"/>
+        <w:gridCol w:w="5093"/>
+        <w:gridCol w:w="5094"/>
       </w:tblGrid>
       <w:tr>
         <w:tc>
@@ -339,8 +357,16 @@
           </w:tcPr>
           <w:p>
             <w:r>
-              <w:t>Sie möchten der Böhmer AG möglichst viele Ausst...</w:t>
-            </w:r>
+              <w:t>Verkauf und Kundenberatung</w:t>
+            </w:r>
+            <w:r>
+              <w:t xml:space="preserve"> - </w:t>
+            </w:r>
+            <w:proofErr w:type="spellStart"/>
+            <w:r>
+              <w:t>Verkaufsgespäch</w:t>
+            </w:r>
+            <w:proofErr w:type="spellEnd"/>
           </w:p>
         </w:tc>
       </w:tr>
@@ -381,8 +407,107 @@
             <w:r>
               <w:t>Sie möchten der Böhmer AG möglichst viele Ausstattungsmöbel verkaufen und stellen deshalb Besonderheiten der neuen Produkte dar. Was sollten Sie bei diesem Verkaufsgespräch beachten?</w:t>
             </w:r>
-            <w:r>
-              <w:br/>
+          </w:p>
+          <w:p/>
+          <w:p>
+            <w:sdt>
+              <w:sdtPr>
+                <w:id w:val="-1328367321"/>
+                <w14:checkbox>
+                  <w14:checked w14:val="0"/>
+                  <w14:checkedState w14:val="2612" w14:font="MS Gothic"/>
+                  <w14:uncheckedState w14:val="2610" w14:font="MS Gothic"/>
+                </w14:checkbox>
+              </w:sdtPr>
+              <w:sdtContent>
+                <w:r>
+                  <w:rPr>
+                    <w:rFonts w:ascii="MS Gothic" w:eastAsia="MS Gothic" w:hAnsi="MS Gothic" w:hint="eastAsia"/>
+                  </w:rPr>
+                  <w:t>☐</w:t>
+                </w:r>
+              </w:sdtContent>
+            </w:sdt>
+            <w:r>
+              <w:t xml:space="preserve"> Antwort 1</w:t>
+            </w:r>
+          </w:p>
+          <w:p>
+            <w:sdt>
+              <w:sdtPr>
+                <w:id w:val="-985399328"/>
+                <w14:checkbox>
+                  <w14:checked w14:val="0"/>
+                  <w14:checkedState w14:val="2612" w14:font="MS Gothic"/>
+                  <w14:uncheckedState w14:val="2610" w14:font="MS Gothic"/>
+                </w14:checkbox>
+              </w:sdtPr>
+              <w:sdtContent>
+                <w:r>
+                  <w:rPr>
+                    <w:rFonts w:ascii="MS Gothic" w:eastAsia="MS Gothic" w:hAnsi="MS Gothic" w:hint="eastAsia"/>
+                  </w:rPr>
+                  <w:t>☐</w:t>
+                </w:r>
+              </w:sdtContent>
+            </w:sdt>
+            <w:r>
+              <w:t xml:space="preserve"> Antwort </w:t>
+            </w:r>
+            <w:r>
+              <w:t>2</w:t>
+            </w:r>
+          </w:p>
+          <w:p>
+            <w:sdt>
+              <w:sdtPr>
+                <w:id w:val="1611553564"/>
+                <w14:checkbox>
+                  <w14:checked w14:val="0"/>
+                  <w14:checkedState w14:val="2612" w14:font="MS Gothic"/>
+                  <w14:uncheckedState w14:val="2610" w14:font="MS Gothic"/>
+                </w14:checkbox>
+              </w:sdtPr>
+              <w:sdtContent>
+                <w:r>
+                  <w:rPr>
+                    <w:rFonts w:ascii="MS Gothic" w:eastAsia="MS Gothic" w:hAnsi="MS Gothic" w:hint="eastAsia"/>
+                  </w:rPr>
+                  <w:t>☐</w:t>
+                </w:r>
+              </w:sdtContent>
+            </w:sdt>
+            <w:r>
+              <w:t xml:space="preserve"> Antwort </w:t>
+            </w:r>
+            <w:r>
+              <w:t>3</w:t>
+            </w:r>
+          </w:p>
+          <w:p>
+            <w:sdt>
+              <w:sdtPr>
+                <w:id w:val="-1627153396"/>
+                <w14:checkbox>
+                  <w14:checked w14:val="0"/>
+                  <w14:checkedState w14:val="2612" w14:font="MS Gothic"/>
+                  <w14:uncheckedState w14:val="2610" w14:font="MS Gothic"/>
+                </w14:checkbox>
+              </w:sdtPr>
+              <w:sdtContent>
+                <w:r>
+                  <w:rPr>
+                    <w:rFonts w:ascii="MS Gothic" w:eastAsia="MS Gothic" w:hAnsi="MS Gothic" w:hint="eastAsia"/>
+                  </w:rPr>
+                  <w:t>☐</w:t>
+                </w:r>
+              </w:sdtContent>
+            </w:sdt>
+            <w:r>
+              <w:t xml:space="preserve"> Antwort </w:t>
+            </w:r>
+            <w:r>
+              <w:t>4</w:t>
             </w:r>
           </w:p>
         </w:tc>
@@ -507,7 +632,7 @@
           </w:tcPr>
           <w:p>
             <w:r>
-              <w:t>Auftragssteuerung und -koordination</w:t>
+              <w:t>Auftragsbearbeitung</w:t>
             </w:r>
           </w:p>
         </w:tc>
@@ -517,12 +642,12 @@
     <w:tbl>
       <w:tblPr>
         <w:tblStyle w:val="Tabellenraster"/>
-        <w:tblW w:w="0" w:type="auto"/>
+        <w:tblW w:w="5000" w:type="pct"/>
         <w:tblLook w:val="04A0" w:firstRow="1" w:lastRow="0" w:firstColumn="1" w:lastColumn="0" w:noHBand="0" w:noVBand="1"/>
       </w:tblPr>
       <w:tblGrid>
-        <w:gridCol w:w="4320"/>
-        <w:gridCol w:w="4320"/>
+        <w:gridCol w:w="5093"/>
+        <w:gridCol w:w="5094"/>
       </w:tblGrid>
       <w:tr>
         <w:tc>
@@ -592,7 +717,10 @@
           </w:tcPr>
           <w:p>
             <w:r>
-              <w:t>Die Vertriebsmitarbeitenden der Böhmer AG benöt...</w:t>
+              <w:t>Verkauf und Kundenberatung -</w:t>
+            </w:r>
+            <w:r>
+              <w:t xml:space="preserve"> Informationsmaterialien</w:t>
             </w:r>
           </w:p>
         </w:tc>
@@ -634,20 +762,37 @@
             <w:r>
               <w:t>Die Vertriebsmitarbeitenden der Böhmer AG benötigen Informationsmaterial für mögliche Kunden in Norwegen und bitten die INN-Büro GmbH um Unterstützung. Welche Informationsmaterialien können Sie der Böhmer AG zur Verfügung stellen? Benennen Sie zwei Möglichkeiten.</w:t>
             </w:r>
-            <w:r>
-              <w:tab/>
-              <w:t>4</w:t>
-            </w:r>
-            <w:r>
-              <w:br/>
-            </w:r>
-            <w:r>
-              <w:br/>
-            </w:r>
-            <w:r>
-              <w:br/>
-            </w:r>
-          </w:p>
+          </w:p>
+          <w:p/>
+          <w:tbl>
+            <w:tblPr>
+              <w:tblStyle w:val="Tabellenraster"/>
+              <w:tblW w:w="0" w:type="auto"/>
+              <w:tblLook w:val="04A0" w:firstRow="1" w:lastRow="0" w:firstColumn="1" w:lastColumn="0" w:noHBand="0" w:noVBand="1"/>
+            </w:tblPr>
+            <w:tblGrid>
+              <w:gridCol w:w="4089"/>
+            </w:tblGrid>
+            <w:tr>
+              <w:trPr>
+                <w:trHeight w:val="1417"/>
+              </w:trPr>
+              <w:tc>
+                <w:tcPr>
+                  <w:tcW w:w="4089" w:type="dxa"/>
+                  <w:tcBorders>
+                    <w:top w:val="nil"/>
+                    <w:left w:val="nil"/>
+                    <w:bottom w:val="single" w:sz="4" w:space="0" w:color="auto"/>
+                    <w:right w:val="nil"/>
+                  </w:tcBorders>
+                  <w:shd w:val="clear" w:color="auto" w:fill="FDE9D9" w:themeFill="accent6" w:themeFillTint="33"/>
+                </w:tcPr>
+                <w:p/>
+              </w:tc>
+            </w:tr>
+          </w:tbl>
+          <w:p/>
         </w:tc>
       </w:tr>
       <w:tr>
@@ -769,7 +914,7 @@
           </w:tcPr>
           <w:p>
             <w:r>
-              <w:t>Auftragssteuerung und -koordination</w:t>
+              <w:t>Auftragsbearbeitung</w:t>
             </w:r>
           </w:p>
         </w:tc>
@@ -779,12 +924,12 @@
     <w:tbl>
       <w:tblPr>
         <w:tblStyle w:val="Tabellenraster"/>
-        <w:tblW w:w="0" w:type="auto"/>
+        <w:tblW w:w="5000" w:type="pct"/>
         <w:tblLook w:val="04A0" w:firstRow="1" w:lastRow="0" w:firstColumn="1" w:lastColumn="0" w:noHBand="0" w:noVBand="1"/>
       </w:tblPr>
       <w:tblGrid>
-        <w:gridCol w:w="4320"/>
-        <w:gridCol w:w="4320"/>
+        <w:gridCol w:w="5093"/>
+        <w:gridCol w:w="5094"/>
       </w:tblGrid>
       <w:tr>
         <w:tc>
@@ -854,7 +999,10 @@
           </w:tcPr>
           <w:p>
             <w:r>
-              <w:t>Nach dem Besuch der Mitarbeitenden der Böhmer A...</w:t>
+              <w:t>Verkauf und Kundenberatung -</w:t>
+            </w:r>
+            <w:r>
+              <w:t xml:space="preserve"> Kalkulation</w:t>
             </w:r>
           </w:p>
         </w:tc>
@@ -901,33 +1049,136 @@
             </w:r>
             <w:r>
               <w:br/>
-              <w:t xml:space="preserve">Berechnen Sie den Verkaufspreis für einen Besprechungstisch im nachfolgenden Schema. Füllen Sie zudem die Lücken in der </w:t>
-            </w:r>
-            <w:r>
-              <w:lastRenderedPageBreak/>
-              <w:t>linken Spalte korrekt aus.</w:t>
-            </w:r>
-            <w:r>
-              <w:tab/>
-              <w:t>16</w:t>
-            </w:r>
-            <w:r>
-              <w:br/>
-            </w:r>
-            <w:r>
-              <w:br/>
-            </w:r>
-            <w:r>
-              <w:br/>
+              <w:t>Berechnen Sie den Verkaufspreis für einen Besprechungstisch im nachfolgenden Schema. Füllen Sie zudem die Lücken in der linken Spalte korrekt aus.</w:t>
+            </w:r>
+          </w:p>
+          <w:p/>
+          <w:tbl>
+            <w:tblPr>
+              <w:tblStyle w:val="Tabellenraster"/>
+              <w:tblW w:w="0" w:type="auto"/>
+              <w:tblLook w:val="04A0" w:firstRow="1" w:lastRow="0" w:firstColumn="1" w:lastColumn="0" w:noHBand="0" w:noVBand="1"/>
+            </w:tblPr>
+            <w:tblGrid>
+              <w:gridCol w:w="2044"/>
+              <w:gridCol w:w="2045"/>
+            </w:tblGrid>
+            <w:tr>
+              <w:tc>
+                <w:tcPr>
+                  <w:tcW w:w="2044" w:type="dxa"/>
+                </w:tcPr>
+                <w:p>
+                  <w:r>
+                    <w:t>Einkaufspreis</w:t>
+                  </w:r>
+                </w:p>
+              </w:tc>
+              <w:tc>
+                <w:tcPr>
+                  <w:tcW w:w="2045" w:type="dxa"/>
+                </w:tcPr>
+                <w:p/>
+              </w:tc>
+            </w:tr>
+            <w:tr>
+              <w:tc>
+                <w:tcPr>
+                  <w:tcW w:w="2044" w:type="dxa"/>
+                </w:tcPr>
+                <w:p/>
+              </w:tc>
+              <w:tc>
+                <w:tcPr>
+                  <w:tcW w:w="2045" w:type="dxa"/>
+                </w:tcPr>
+                <w:p/>
+              </w:tc>
+            </w:tr>
+            <w:tr>
+              <w:tc>
+                <w:tcPr>
+                  <w:tcW w:w="2044" w:type="dxa"/>
+                </w:tcPr>
+                <w:p/>
+              </w:tc>
+              <w:tc>
+                <w:tcPr>
+                  <w:tcW w:w="2045" w:type="dxa"/>
+                </w:tcPr>
+                <w:p/>
+              </w:tc>
+            </w:tr>
+            <w:tr>
+              <w:tc>
+                <w:tcPr>
+                  <w:tcW w:w="2044" w:type="dxa"/>
+                </w:tcPr>
+                <w:p/>
+              </w:tc>
+              <w:tc>
+                <w:tcPr>
+                  <w:tcW w:w="2045" w:type="dxa"/>
+                </w:tcPr>
+                <w:p/>
+              </w:tc>
+            </w:tr>
+            <w:tr>
+              <w:tc>
+                <w:tcPr>
+                  <w:tcW w:w="2044" w:type="dxa"/>
+                </w:tcPr>
+                <w:p>
+                  <w:r>
+                    <w:t>Verkaufspreis</w:t>
+                  </w:r>
+                </w:p>
+              </w:tc>
+              <w:tc>
+                <w:tcPr>
+                  <w:tcW w:w="2045" w:type="dxa"/>
+                </w:tcPr>
+                <w:p/>
+              </w:tc>
+            </w:tr>
+          </w:tbl>
+          <w:p/>
+          <w:p/>
+          <w:p>
+            <w:r>
               <w:t>Platz für Kalkulationen</w:t>
             </w:r>
-            <w:r>
-              <w:br/>
-            </w:r>
-            <w:r>
-              <w:br/>
-            </w:r>
-          </w:p>
+          </w:p>
+          <w:p/>
+          <w:tbl>
+            <w:tblPr>
+              <w:tblStyle w:val="Tabellenraster"/>
+              <w:tblW w:w="0" w:type="auto"/>
+              <w:tblLook w:val="04A0" w:firstRow="1" w:lastRow="0" w:firstColumn="1" w:lastColumn="0" w:noHBand="0" w:noVBand="1"/>
+            </w:tblPr>
+            <w:tblGrid>
+              <w:gridCol w:w="4089"/>
+            </w:tblGrid>
+            <w:tr>
+              <w:trPr>
+                <w:trHeight w:val="1417"/>
+              </w:trPr>
+              <w:tc>
+                <w:tcPr>
+                  <w:tcW w:w="4089" w:type="dxa"/>
+                  <w:tcBorders>
+                    <w:top w:val="nil"/>
+                    <w:left w:val="nil"/>
+                    <w:bottom w:val="single" w:sz="4" w:space="0" w:color="auto"/>
+                    <w:right w:val="nil"/>
+                  </w:tcBorders>
+                  <w:shd w:val="clear" w:color="auto" w:fill="FDE9D9" w:themeFill="accent6" w:themeFillTint="33"/>
+                </w:tcPr>
+                <w:p/>
+              </w:tc>
+            </w:tr>
+          </w:tbl>
+          <w:p/>
         </w:tc>
       </w:tr>
       <w:tr>
@@ -1054,7 +1305,7 @@
           </w:tcPr>
           <w:p>
             <w:r>
-              <w:t>Auftragssteuerung und -koordination</w:t>
+              <w:t>Auftragsbearbeitung</w:t>
             </w:r>
           </w:p>
         </w:tc>
@@ -1068,12 +1319,12 @@
     <w:tbl>
       <w:tblPr>
         <w:tblStyle w:val="Tabellenraster"/>
-        <w:tblW w:w="0" w:type="auto"/>
+        <w:tblW w:w="5000" w:type="pct"/>
         <w:tblLook w:val="04A0" w:firstRow="1" w:lastRow="0" w:firstColumn="1" w:lastColumn="0" w:noHBand="0" w:noVBand="1"/>
       </w:tblPr>
       <w:tblGrid>
-        <w:gridCol w:w="4320"/>
-        <w:gridCol w:w="4320"/>
+        <w:gridCol w:w="5093"/>
+        <w:gridCol w:w="5094"/>
       </w:tblGrid>
       <w:tr>
         <w:tc>
@@ -1143,7 +1394,10 @@
           </w:tcPr>
           <w:p>
             <w:r>
-              <w:t>Am 03. März 20xx bittet Sie die Böhmer AG per E...</w:t>
+              <w:t>Verkauf und Kundenberatung -</w:t>
+            </w:r>
+            <w:r>
+              <w:t xml:space="preserve"> Irrtum</w:t>
             </w:r>
           </w:p>
         </w:tc>
@@ -1183,7 +1437,15 @@
           </w:tcPr>
           <w:p>
             <w:r>
-              <w:t>Am 03. März 20xx bittet Sie die Böhmer AG per E-Mail um ein Angebot über 20 Besprechungstische der neuen Produktlinie 'FancyCarbon'. Sie kalkulieren mit einem Listenverkaufspreis von 400,00 €. Am 06. März 20xx wurde das Angebot für die Böhmer AG über 20 Besprechungstische der neuen Produktlinie versendet.</w:t>
+              <w:t>Am 03. März 20xx bittet Sie die Böhmer AG per E-Mail um ein Angebot über 20 Besprechungstische der neuen Produktlinie '</w:t>
+            </w:r>
+            <w:proofErr w:type="spellStart"/>
+            <w:r>
+              <w:t>FancyCarbon</w:t>
+            </w:r>
+            <w:proofErr w:type="spellEnd"/>
+            <w:r>
+              <w:t>'. Sie kalkulieren mit einem Listenverkaufspreis von 400,00 €. Am 06. März 20xx wurde das Angebot für die Böhmer AG über 20 Besprechungstische der neuen Produktlinie versendet.</w:t>
             </w:r>
             <w:r>
               <w:br/>
@@ -1206,18 +1468,99 @@
               <w:br/>
               <w:t>Ist durch das Angebot und die Bestellung ein Kaufvertrag zu Stande gekommen? Geben Sie die zutreffende Begründung an.</w:t>
             </w:r>
-            <w:r>
-              <w:tab/>
-              <w:t>2</w:t>
-            </w:r>
-            <w:r>
-              <w:br/>
-            </w:r>
-            <w:r>
-              <w:br/>
-            </w:r>
-            <w:r>
-              <w:br/>
+          </w:p>
+          <w:p/>
+          <w:p/>
+          <w:p>
+            <w:sdt>
+              <w:sdtPr>
+                <w:id w:val="767815214"/>
+                <w14:checkbox>
+                  <w14:checked w14:val="0"/>
+                  <w14:checkedState w14:val="2612" w14:font="MS Gothic"/>
+                  <w14:uncheckedState w14:val="2610" w14:font="MS Gothic"/>
+                </w14:checkbox>
+              </w:sdtPr>
+              <w:sdtContent>
+                <w:r>
+                  <w:rPr>
+                    <w:rFonts w:ascii="MS Gothic" w:eastAsia="MS Gothic" w:hAnsi="MS Gothic" w:hint="eastAsia"/>
+                  </w:rPr>
+                  <w:t>☐</w:t>
+                </w:r>
+              </w:sdtContent>
+            </w:sdt>
+            <w:r>
+              <w:t xml:space="preserve"> Antwort 1</w:t>
+            </w:r>
+          </w:p>
+          <w:p>
+            <w:sdt>
+              <w:sdtPr>
+                <w:id w:val="-956569491"/>
+                <w14:checkbox>
+                  <w14:checked w14:val="0"/>
+                  <w14:checkedState w14:val="2612" w14:font="MS Gothic"/>
+                  <w14:uncheckedState w14:val="2610" w14:font="MS Gothic"/>
+                </w14:checkbox>
+              </w:sdtPr>
+              <w:sdtContent>
+                <w:r>
+                  <w:rPr>
+                    <w:rFonts w:ascii="MS Gothic" w:eastAsia="MS Gothic" w:hAnsi="MS Gothic" w:hint="eastAsia"/>
+                  </w:rPr>
+                  <w:t>☐</w:t>
+                </w:r>
+              </w:sdtContent>
+            </w:sdt>
+            <w:r>
+              <w:t xml:space="preserve"> Antwort 2</w:t>
+            </w:r>
+          </w:p>
+          <w:p>
+            <w:sdt>
+              <w:sdtPr>
+                <w:id w:val="118418213"/>
+                <w14:checkbox>
+                  <w14:checked w14:val="0"/>
+                  <w14:checkedState w14:val="2612" w14:font="MS Gothic"/>
+                  <w14:uncheckedState w14:val="2610" w14:font="MS Gothic"/>
+                </w14:checkbox>
+              </w:sdtPr>
+              <w:sdtContent>
+                <w:r>
+                  <w:rPr>
+                    <w:rFonts w:ascii="MS Gothic" w:eastAsia="MS Gothic" w:hAnsi="MS Gothic" w:hint="eastAsia"/>
+                  </w:rPr>
+                  <w:t>☐</w:t>
+                </w:r>
+              </w:sdtContent>
+            </w:sdt>
+            <w:r>
+              <w:t xml:space="preserve"> Antwort 3</w:t>
+            </w:r>
+          </w:p>
+          <w:p>
+            <w:sdt>
+              <w:sdtPr>
+                <w:id w:val="1223954382"/>
+                <w14:checkbox>
+                  <w14:checked w14:val="0"/>
+                  <w14:checkedState w14:val="2612" w14:font="MS Gothic"/>
+                  <w14:uncheckedState w14:val="2610" w14:font="MS Gothic"/>
+                </w14:checkbox>
+              </w:sdtPr>
+              <w:sdtContent>
+                <w:r>
+                  <w:rPr>
+                    <w:rFonts w:ascii="MS Gothic" w:eastAsia="MS Gothic" w:hAnsi="MS Gothic" w:hint="eastAsia"/>
+                  </w:rPr>
+                  <w:t>☐</w:t>
+                </w:r>
+              </w:sdtContent>
+            </w:sdt>
+            <w:r>
+              <w:t xml:space="preserve"> Antwort 4</w:t>
             </w:r>
           </w:p>
         </w:tc>
@@ -1229,6 +1572,7 @@
           </w:tcPr>
           <w:p>
             <w:r>
+              <w:lastRenderedPageBreak/>
               <w:t>Lösungsmöglichkeit/Hinweis (optional)</w:t>
             </w:r>
           </w:p>
@@ -1309,7 +1653,6 @@
           </w:tcPr>
           <w:p>
             <w:r>
-              <w:lastRenderedPageBreak/>
               <w:t>Quelle/Kommentar (optional)</w:t>
             </w:r>
           </w:p>
@@ -1338,7 +1681,7 @@
           </w:tcPr>
           <w:p>
             <w:r>
-              <w:t>Auftragssteuerung und -koordination</w:t>
+              <w:t>Auftragsbearbeitung</w:t>
             </w:r>
           </w:p>
         </w:tc>
@@ -1352,12 +1695,12 @@
     <w:tbl>
       <w:tblPr>
         <w:tblStyle w:val="Tabellenraster"/>
-        <w:tblW w:w="0" w:type="auto"/>
+        <w:tblW w:w="5000" w:type="pct"/>
         <w:tblLook w:val="04A0" w:firstRow="1" w:lastRow="0" w:firstColumn="1" w:lastColumn="0" w:noHBand="0" w:noVBand="1"/>
       </w:tblPr>
       <w:tblGrid>
-        <w:gridCol w:w="4320"/>
-        <w:gridCol w:w="4320"/>
+        <w:gridCol w:w="5093"/>
+        <w:gridCol w:w="5094"/>
       </w:tblGrid>
       <w:tr>
         <w:tc>
@@ -1427,7 +1770,16 @@
           </w:tcPr>
           <w:p>
             <w:r>
-              <w:t>Welche rechtliche Möglichkeit hat die INN-Büro ...</w:t>
+              <w:t xml:space="preserve">Verkauf und Kundenberatung </w:t>
+            </w:r>
+            <w:r>
+              <w:t>–</w:t>
+            </w:r>
+            <w:r>
+              <w:t xml:space="preserve"> Irrtum</w:t>
+            </w:r>
+            <w:r>
+              <w:t>, Recht</w:t>
             </w:r>
           </w:p>
         </w:tc>
@@ -1469,18 +1821,98 @@
             <w:r>
               <w:t>Welche rechtliche Möglichkeit hat die INN-Büro GmbH, das Problem zu lösen?</w:t>
             </w:r>
-            <w:r>
-              <w:tab/>
-              <w:t>2</w:t>
-            </w:r>
-            <w:r>
-              <w:br/>
-            </w:r>
-            <w:r>
-              <w:br/>
-            </w:r>
-            <w:r>
-              <w:br/>
+          </w:p>
+          <w:p/>
+          <w:p>
+            <w:sdt>
+              <w:sdtPr>
+                <w:id w:val="1398868925"/>
+                <w14:checkbox>
+                  <w14:checked w14:val="0"/>
+                  <w14:checkedState w14:val="2612" w14:font="MS Gothic"/>
+                  <w14:uncheckedState w14:val="2610" w14:font="MS Gothic"/>
+                </w14:checkbox>
+              </w:sdtPr>
+              <w:sdtContent>
+                <w:r>
+                  <w:rPr>
+                    <w:rFonts w:ascii="MS Gothic" w:eastAsia="MS Gothic" w:hAnsi="MS Gothic" w:hint="eastAsia"/>
+                  </w:rPr>
+                  <w:t>☐</w:t>
+                </w:r>
+              </w:sdtContent>
+            </w:sdt>
+            <w:r>
+              <w:t xml:space="preserve"> Antwort 1</w:t>
+            </w:r>
+          </w:p>
+          <w:p>
+            <w:sdt>
+              <w:sdtPr>
+                <w:id w:val="-1735927115"/>
+                <w14:checkbox>
+                  <w14:checked w14:val="0"/>
+                  <w14:checkedState w14:val="2612" w14:font="MS Gothic"/>
+                  <w14:uncheckedState w14:val="2610" w14:font="MS Gothic"/>
+                </w14:checkbox>
+              </w:sdtPr>
+              <w:sdtContent>
+                <w:r>
+                  <w:rPr>
+                    <w:rFonts w:ascii="MS Gothic" w:eastAsia="MS Gothic" w:hAnsi="MS Gothic" w:hint="eastAsia"/>
+                  </w:rPr>
+                  <w:t>☐</w:t>
+                </w:r>
+              </w:sdtContent>
+            </w:sdt>
+            <w:r>
+              <w:t xml:space="preserve"> Antwort 2</w:t>
+            </w:r>
+          </w:p>
+          <w:p>
+            <w:sdt>
+              <w:sdtPr>
+                <w:id w:val="-874149663"/>
+                <w14:checkbox>
+                  <w14:checked w14:val="0"/>
+                  <w14:checkedState w14:val="2612" w14:font="MS Gothic"/>
+                  <w14:uncheckedState w14:val="2610" w14:font="MS Gothic"/>
+                </w14:checkbox>
+              </w:sdtPr>
+              <w:sdtContent>
+                <w:r>
+                  <w:rPr>
+                    <w:rFonts w:ascii="MS Gothic" w:eastAsia="MS Gothic" w:hAnsi="MS Gothic" w:hint="eastAsia"/>
+                  </w:rPr>
+                  <w:t>☐</w:t>
+                </w:r>
+              </w:sdtContent>
+            </w:sdt>
+            <w:r>
+              <w:t xml:space="preserve"> Antwort 3</w:t>
+            </w:r>
+          </w:p>
+          <w:p>
+            <w:sdt>
+              <w:sdtPr>
+                <w:id w:val="2144617794"/>
+                <w14:checkbox>
+                  <w14:checked w14:val="0"/>
+                  <w14:checkedState w14:val="2612" w14:font="MS Gothic"/>
+                  <w14:uncheckedState w14:val="2610" w14:font="MS Gothic"/>
+                </w14:checkbox>
+              </w:sdtPr>
+              <w:sdtContent>
+                <w:r>
+                  <w:rPr>
+                    <w:rFonts w:ascii="MS Gothic" w:eastAsia="MS Gothic" w:hAnsi="MS Gothic" w:hint="eastAsia"/>
+                  </w:rPr>
+                  <w:t>☐</w:t>
+                </w:r>
+              </w:sdtContent>
+            </w:sdt>
+            <w:r>
+              <w:t xml:space="preserve"> Antwort 4</w:t>
             </w:r>
           </w:p>
         </w:tc>
@@ -1600,7 +2032,7 @@
           </w:tcPr>
           <w:p>
             <w:r>
-              <w:t>Auftragssteuerung und -koordination</w:t>
+              <w:t>Auftragsbearbeitung</w:t>
             </w:r>
           </w:p>
         </w:tc>
@@ -1614,12 +2046,12 @@
     <w:tbl>
       <w:tblPr>
         <w:tblStyle w:val="Tabellenraster"/>
-        <w:tblW w:w="0" w:type="auto"/>
+        <w:tblW w:w="5000" w:type="pct"/>
         <w:tblLook w:val="04A0" w:firstRow="1" w:lastRow="0" w:firstColumn="1" w:lastColumn="0" w:noHBand="0" w:noVBand="1"/>
       </w:tblPr>
       <w:tblGrid>
-        <w:gridCol w:w="4320"/>
-        <w:gridCol w:w="4320"/>
+        <w:gridCol w:w="5093"/>
+        <w:gridCol w:w="5094"/>
       </w:tblGrid>
       <w:tr>
         <w:tc>
@@ -1682,7 +2114,7 @@
           </w:tcPr>
           <w:p>
             <w:r>
-              <w:t>Ordnen Sie zu, indem die Kennziffern der rechtl...</w:t>
+              <w:t>Kaufvertrag - Gültigkeit</w:t>
             </w:r>
           </w:p>
         </w:tc>
@@ -1704,10 +2136,6 @@
           </w:tcPr>
           <w:p>
             <w:r>
-              <w:t>Vertragswesen</w:t>
-            </w:r>
-            <w:r>
-              <w:br/>
               <w:t xml:space="preserve">Sie sollen für die INN-Büro GmbH ein Informationsblatt zum Thema Gültigkeit von Kaufverträgen erstellen. Sie haben Beispiele zusammengetragen und überprüfen diese. </w:t>
             </w:r>
             <w:r>
@@ -1735,18 +2163,105 @@
             <w:r>
               <w:t>Ordnen Sie zu, indem die Kennziffern der rechtlichen Bedeutungen in die Kästchen neben den zutreffenden Beispielen eintragen.</w:t>
             </w:r>
-            <w:r>
-              <w:tab/>
-              <w:t>6</w:t>
-            </w:r>
-            <w:r>
-              <w:br/>
-            </w:r>
-            <w:r>
-              <w:br/>
-            </w:r>
-            <w:r>
-              <w:br/>
+          </w:p>
+          <w:p/>
+          <w:p/>
+          <w:p>
+            <w:sdt>
+              <w:sdtPr>
+                <w:id w:val="1637988666"/>
+                <w14:checkbox>
+                  <w14:checked w14:val="0"/>
+                  <w14:checkedState w14:val="2612" w14:font="MS Gothic"/>
+                  <w14:uncheckedState w14:val="2610" w14:font="MS Gothic"/>
+                </w14:checkbox>
+              </w:sdtPr>
+              <w:sdtContent>
+                <w:r>
+                  <w:rPr>
+                    <w:rFonts w:ascii="MS Gothic" w:eastAsia="MS Gothic" w:hAnsi="MS Gothic" w:hint="eastAsia"/>
+                  </w:rPr>
+                  <w:t>☐</w:t>
+                </w:r>
+              </w:sdtContent>
+            </w:sdt>
+            <w:r>
+              <w:t xml:space="preserve"> Antwort 1</w:t>
+            </w:r>
+          </w:p>
+          <w:p>
+            <w:sdt>
+              <w:sdtPr>
+                <w:id w:val="1103149135"/>
+                <w14:checkbox>
+                  <w14:checked w14:val="0"/>
+                  <w14:checkedState w14:val="2612" w14:font="MS Gothic"/>
+                  <w14:uncheckedState w14:val="2610" w14:font="MS Gothic"/>
+                </w14:checkbox>
+              </w:sdtPr>
+              <w:sdtContent>
+                <w:r>
+                  <w:rPr>
+                    <w:rFonts w:ascii="MS Gothic" w:eastAsia="MS Gothic" w:hAnsi="MS Gothic" w:hint="eastAsia"/>
+                  </w:rPr>
+                  <w:t>☐</w:t>
+                </w:r>
+              </w:sdtContent>
+            </w:sdt>
+            <w:r>
+              <w:t xml:space="preserve"> Antwort 2</w:t>
+            </w:r>
+          </w:p>
+          <w:p>
+            <w:sdt>
+              <w:sdtPr>
+                <w:id w:val="338813278"/>
+                <w14:checkbox>
+                  <w14:checked w14:val="0"/>
+                  <w14:checkedState w14:val="2612" w14:font="MS Gothic"/>
+                  <w14:uncheckedState w14:val="2610" w14:font="MS Gothic"/>
+                </w14:checkbox>
+              </w:sdtPr>
+              <w:sdtContent>
+                <w:r>
+                  <w:rPr>
+                    <w:rFonts w:ascii="MS Gothic" w:eastAsia="MS Gothic" w:hAnsi="MS Gothic" w:hint="eastAsia"/>
+                  </w:rPr>
+                  <w:t>☐</w:t>
+                </w:r>
+              </w:sdtContent>
+            </w:sdt>
+            <w:r>
+              <w:t xml:space="preserve"> Antwort 3</w:t>
+            </w:r>
+          </w:p>
+          <w:p>
+            <w:sdt>
+              <w:sdtPr>
+                <w:id w:val="1284393203"/>
+                <w14:checkbox>
+                  <w14:checked w14:val="0"/>
+                  <w14:checkedState w14:val="2612" w14:font="MS Gothic"/>
+                  <w14:uncheckedState w14:val="2610" w14:font="MS Gothic"/>
+                </w14:checkbox>
+              </w:sdtPr>
+              <w:sdtContent>
+                <w:r>
+                  <w:rPr>
+                    <w:rFonts w:ascii="MS Gothic" w:eastAsia="MS Gothic" w:hAnsi="MS Gothic" w:hint="eastAsia"/>
+                  </w:rPr>
+                  <w:t>☐</w:t>
+                </w:r>
+              </w:sdtContent>
+            </w:sdt>
+            <w:r>
+              <w:t xml:space="preserve"> Antwort 4</w:t>
+            </w:r>
+          </w:p>
+          <w:p/>
+          <w:p>
+            <w:r>
+              <w:lastRenderedPageBreak/>
               <w:t>1 – Der Vertrag ist anfechtbar; 2 – Der Vertrag ist nichtig; 3 – Der Vertrag ist gültig.</w:t>
             </w:r>
             <w:r>
@@ -1762,6 +2277,7 @@
           </w:tcPr>
           <w:p>
             <w:r>
+              <w:lastRenderedPageBreak/>
               <w:t>Lösungsmöglichkeit/Hinweis (optional)</w:t>
             </w:r>
           </w:p>
@@ -1874,7 +2390,7 @@
           </w:tcPr>
           <w:p>
             <w:r>
-              <w:t>Auftragssteuerung und -koordination</w:t>
+              <w:t>Vertragswesen</w:t>
             </w:r>
           </w:p>
         </w:tc>
@@ -1888,12 +2404,12 @@
     <w:tbl>
       <w:tblPr>
         <w:tblStyle w:val="Tabellenraster"/>
-        <w:tblW w:w="0" w:type="auto"/>
+        <w:tblW w:w="5000" w:type="pct"/>
         <w:tblLook w:val="04A0" w:firstRow="1" w:lastRow="0" w:firstColumn="1" w:lastColumn="0" w:noHBand="0" w:noVBand="1"/>
       </w:tblPr>
       <w:tblGrid>
-        <w:gridCol w:w="4320"/>
-        <w:gridCol w:w="5181"/>
+        <w:gridCol w:w="4632"/>
+        <w:gridCol w:w="5555"/>
       </w:tblGrid>
       <w:tr>
         <w:tc>
@@ -1913,7 +2429,6 @@
                 <w:rFonts w:asciiTheme="minorHAnsi" w:hAnsiTheme="minorHAnsi"/>
                 <w:lang w:val="en-US"/>
               </w:rPr>
-              <w:lastRenderedPageBreak/>
               <w:t>ID</w:t>
             </w:r>
           </w:p>
@@ -1957,7 +2472,15 @@
           </w:tcPr>
           <w:p>
             <w:r>
-              <w:t>Schreiben Sie in ganzen Sätzen, nicht stichwort...</w:t>
+              <w:t xml:space="preserve">Schreiben Sie in ganzen Sätzen, nicht </w:t>
+            </w:r>
+            <w:proofErr w:type="spellStart"/>
+            <w:r>
+              <w:t>stichwort</w:t>
+            </w:r>
+            <w:proofErr w:type="spellEnd"/>
+            <w:r>
+              <w:t>...</w:t>
             </w:r>
           </w:p>
         </w:tc>
@@ -2154,17 +2677,17 @@
     <w:tbl>
       <w:tblPr>
         <w:tblStyle w:val="Tabellenraster"/>
-        <w:tblW w:w="0" w:type="auto"/>
+        <w:tblW w:w="5000" w:type="pct"/>
         <w:tblLook w:val="04A0" w:firstRow="1" w:lastRow="0" w:firstColumn="1" w:lastColumn="0" w:noHBand="0" w:noVBand="1"/>
       </w:tblPr>
       <w:tblGrid>
-        <w:gridCol w:w="4320"/>
-        <w:gridCol w:w="4320"/>
+        <w:gridCol w:w="4644"/>
+        <w:gridCol w:w="5543"/>
       </w:tblGrid>
       <w:tr>
         <w:tc>
           <w:tcPr>
-            <w:tcW w:w="4320" w:type="dxa"/>
+            <w:tcW w:w="4644" w:type="dxa"/>
           </w:tcPr>
           <w:p>
             <w:pPr>
@@ -2185,7 +2708,7 @@
         </w:tc>
         <w:tc>
           <w:tcPr>
-            <w:tcW w:w="4320" w:type="dxa"/>
+            <w:tcW w:w="5543" w:type="dxa"/>
           </w:tcPr>
           <w:p>
             <w:pPr>
@@ -2208,7 +2731,7 @@
       <w:tr>
         <w:tc>
           <w:tcPr>
-            <w:tcW w:w="4320" w:type="dxa"/>
+            <w:tcW w:w="4644" w:type="dxa"/>
           </w:tcPr>
           <w:p>
             <w:r>
@@ -2218,7 +2741,7 @@
         </w:tc>
         <w:tc>
           <w:tcPr>
-            <w:tcW w:w="4320" w:type="dxa"/>
+            <w:tcW w:w="5543" w:type="dxa"/>
           </w:tcPr>
           <w:p>
             <w:r>
@@ -2230,7 +2753,7 @@
       <w:tr>
         <w:tc>
           <w:tcPr>
-            <w:tcW w:w="4320" w:type="dxa"/>
+            <w:tcW w:w="4644" w:type="dxa"/>
           </w:tcPr>
           <w:p>
             <w:r>
@@ -2240,7 +2763,7 @@
         </w:tc>
         <w:tc>
           <w:tcPr>
-            <w:tcW w:w="4320" w:type="dxa"/>
+            <w:tcW w:w="5543" w:type="dxa"/>
           </w:tcPr>
           <w:p>
             <w:r>
@@ -2248,7 +2771,15 @@
             </w:r>
             <w:r>
               <w:br/>
-              <w:t>Die INN-Büro GmbH hat Bürostühle des Modells Ergorelax 160 an die Livingston GmbH verkauft. Den Auftragsvorgang können Sie der folgenden Übersicht entnehmen.</w:t>
+              <w:t xml:space="preserve">Die INN-Büro GmbH hat Bürostühle des Modells </w:t>
+            </w:r>
+            <w:proofErr w:type="spellStart"/>
+            <w:r>
+              <w:t>Ergorelax</w:t>
+            </w:r>
+            <w:proofErr w:type="spellEnd"/>
+            <w:r>
+              <w:t xml:space="preserve"> 160 an die Livingston GmbH verkauft. Den Auftragsvorgang können Sie der folgenden Übersicht entnehmen.</w:t>
             </w:r>
             <w:r>
               <w:br/>
@@ -2265,7 +2796,7 @@
       <w:tr>
         <w:tc>
           <w:tcPr>
-            <w:tcW w:w="4320" w:type="dxa"/>
+            <w:tcW w:w="4644" w:type="dxa"/>
           </w:tcPr>
           <w:p>
             <w:r>
@@ -2275,7 +2806,7 @@
         </w:tc>
         <w:tc>
           <w:tcPr>
-            <w:tcW w:w="4320" w:type="dxa"/>
+            <w:tcW w:w="5543" w:type="dxa"/>
           </w:tcPr>
           <w:p>
             <w:r>
@@ -2300,7 +2831,7 @@
       <w:tr>
         <w:tc>
           <w:tcPr>
-            <w:tcW w:w="4320" w:type="dxa"/>
+            <w:tcW w:w="4644" w:type="dxa"/>
           </w:tcPr>
           <w:p>
             <w:r>
@@ -2310,7 +2841,7 @@
         </w:tc>
         <w:tc>
           <w:tcPr>
-            <w:tcW w:w="4320" w:type="dxa"/>
+            <w:tcW w:w="5543" w:type="dxa"/>
           </w:tcPr>
           <w:p/>
         </w:tc>
@@ -2318,7 +2849,7 @@
       <w:tr>
         <w:tc>
           <w:tcPr>
-            <w:tcW w:w="4320" w:type="dxa"/>
+            <w:tcW w:w="4644" w:type="dxa"/>
           </w:tcPr>
           <w:p>
             <w:r>
@@ -2328,7 +2859,7 @@
         </w:tc>
         <w:tc>
           <w:tcPr>
-            <w:tcW w:w="4320" w:type="dxa"/>
+            <w:tcW w:w="5543" w:type="dxa"/>
           </w:tcPr>
           <w:p/>
         </w:tc>
@@ -2336,17 +2867,18 @@
       <w:tr>
         <w:tc>
           <w:tcPr>
-            <w:tcW w:w="4320" w:type="dxa"/>
-          </w:tcPr>
-          <w:p>
-            <w:r>
+            <w:tcW w:w="4644" w:type="dxa"/>
+          </w:tcPr>
+          <w:p>
+            <w:r>
+              <w:lastRenderedPageBreak/>
               <w:t>Schwierigkeitsgrad</w:t>
             </w:r>
           </w:p>
         </w:tc>
         <w:tc>
           <w:tcPr>
-            <w:tcW w:w="4320" w:type="dxa"/>
+            <w:tcW w:w="5543" w:type="dxa"/>
           </w:tcPr>
           <w:p>
             <w:r>
@@ -2358,7 +2890,7 @@
       <w:tr>
         <w:tc>
           <w:tcPr>
-            <w:tcW w:w="4320" w:type="dxa"/>
+            <w:tcW w:w="4644" w:type="dxa"/>
           </w:tcPr>
           <w:p>
             <w:r>
@@ -2368,7 +2900,7 @@
         </w:tc>
         <w:tc>
           <w:tcPr>
-            <w:tcW w:w="4320" w:type="dxa"/>
+            <w:tcW w:w="5543" w:type="dxa"/>
           </w:tcPr>
           <w:p>
             <w:r>
@@ -2380,7 +2912,7 @@
       <w:tr>
         <w:tc>
           <w:tcPr>
-            <w:tcW w:w="4320" w:type="dxa"/>
+            <w:tcW w:w="4644" w:type="dxa"/>
           </w:tcPr>
           <w:p>
             <w:r>
@@ -2390,7 +2922,7 @@
         </w:tc>
         <w:tc>
           <w:tcPr>
-            <w:tcW w:w="4320" w:type="dxa"/>
+            <w:tcW w:w="5543" w:type="dxa"/>
           </w:tcPr>
           <w:p/>
         </w:tc>
@@ -2398,7 +2930,7 @@
       <w:tr>
         <w:tc>
           <w:tcPr>
-            <w:tcW w:w="4320" w:type="dxa"/>
+            <w:tcW w:w="4644" w:type="dxa"/>
           </w:tcPr>
           <w:p>
             <w:r>
@@ -2408,7 +2940,7 @@
         </w:tc>
         <w:tc>
           <w:tcPr>
-            <w:tcW w:w="4320" w:type="dxa"/>
+            <w:tcW w:w="5543" w:type="dxa"/>
           </w:tcPr>
           <w:p>
             <w:r>
@@ -2428,17 +2960,17 @@
     <w:tbl>
       <w:tblPr>
         <w:tblStyle w:val="Tabellenraster"/>
-        <w:tblW w:w="0" w:type="auto"/>
+        <w:tblW w:w="5000" w:type="pct"/>
         <w:tblLook w:val="04A0" w:firstRow="1" w:lastRow="0" w:firstColumn="1" w:lastColumn="0" w:noHBand="0" w:noVBand="1"/>
       </w:tblPr>
       <w:tblGrid>
-        <w:gridCol w:w="4320"/>
-        <w:gridCol w:w="4320"/>
+        <w:gridCol w:w="4644"/>
+        <w:gridCol w:w="5543"/>
       </w:tblGrid>
       <w:tr>
         <w:tc>
           <w:tcPr>
-            <w:tcW w:w="4320" w:type="dxa"/>
+            <w:tcW w:w="4644" w:type="dxa"/>
           </w:tcPr>
           <w:p>
             <w:pPr>
@@ -2459,7 +2991,7 @@
         </w:tc>
         <w:tc>
           <w:tcPr>
-            <w:tcW w:w="4320" w:type="dxa"/>
+            <w:tcW w:w="5543" w:type="dxa"/>
           </w:tcPr>
           <w:p>
             <w:pPr>
@@ -2489,22 +3021,29 @@
       <w:tr>
         <w:tc>
           <w:tcPr>
-            <w:tcW w:w="4320" w:type="dxa"/>
-          </w:tcPr>
-          <w:p>
-            <w:r>
-              <w:lastRenderedPageBreak/>
+            <w:tcW w:w="4644" w:type="dxa"/>
+          </w:tcPr>
+          <w:p>
+            <w:r>
               <w:t>Titel</w:t>
             </w:r>
           </w:p>
         </w:tc>
         <w:tc>
           <w:tcPr>
-            <w:tcW w:w="4320" w:type="dxa"/>
-          </w:tcPr>
-          <w:p>
-            <w:r>
-              <w:t>Geben Sie an, zu welchem Zeitpunkt der Kaufvert...</w:t>
+            <w:tcW w:w="5543" w:type="dxa"/>
+          </w:tcPr>
+          <w:p>
+            <w:r>
+              <w:t xml:space="preserve">Geben Sie an, zu welchem Zeitpunkt der </w:t>
+            </w:r>
+            <w:proofErr w:type="spellStart"/>
+            <w:r>
+              <w:t>Kaufvert</w:t>
+            </w:r>
+            <w:proofErr w:type="spellEnd"/>
+            <w:r>
+              <w:t>...</w:t>
             </w:r>
           </w:p>
         </w:tc>
@@ -2512,7 +3051,7 @@
       <w:tr>
         <w:tc>
           <w:tcPr>
-            <w:tcW w:w="4320" w:type="dxa"/>
+            <w:tcW w:w="4644" w:type="dxa"/>
           </w:tcPr>
           <w:p>
             <w:r>
@@ -2522,7 +3061,7 @@
         </w:tc>
         <w:tc>
           <w:tcPr>
-            <w:tcW w:w="4320" w:type="dxa"/>
+            <w:tcW w:w="5543" w:type="dxa"/>
           </w:tcPr>
           <w:p/>
         </w:tc>
@@ -2530,7 +3069,7 @@
       <w:tr>
         <w:tc>
           <w:tcPr>
-            <w:tcW w:w="4320" w:type="dxa"/>
+            <w:tcW w:w="4644" w:type="dxa"/>
           </w:tcPr>
           <w:p>
             <w:r>
@@ -2540,7 +3079,7 @@
         </w:tc>
         <w:tc>
           <w:tcPr>
-            <w:tcW w:w="4320" w:type="dxa"/>
+            <w:tcW w:w="5543" w:type="dxa"/>
           </w:tcPr>
           <w:p>
             <w:r>
@@ -2565,7 +3104,7 @@
       <w:tr>
         <w:tc>
           <w:tcPr>
-            <w:tcW w:w="4320" w:type="dxa"/>
+            <w:tcW w:w="4644" w:type="dxa"/>
           </w:tcPr>
           <w:p>
             <w:r>
@@ -2575,7 +3114,7 @@
         </w:tc>
         <w:tc>
           <w:tcPr>
-            <w:tcW w:w="4320" w:type="dxa"/>
+            <w:tcW w:w="5543" w:type="dxa"/>
           </w:tcPr>
           <w:p/>
         </w:tc>
@@ -2583,7 +3122,7 @@
       <w:tr>
         <w:tc>
           <w:tcPr>
-            <w:tcW w:w="4320" w:type="dxa"/>
+            <w:tcW w:w="4644" w:type="dxa"/>
           </w:tcPr>
           <w:p>
             <w:r>
@@ -2593,7 +3132,7 @@
         </w:tc>
         <w:tc>
           <w:tcPr>
-            <w:tcW w:w="4320" w:type="dxa"/>
+            <w:tcW w:w="5543" w:type="dxa"/>
           </w:tcPr>
           <w:p/>
         </w:tc>
@@ -2601,7 +3140,7 @@
       <w:tr>
         <w:tc>
           <w:tcPr>
-            <w:tcW w:w="4320" w:type="dxa"/>
+            <w:tcW w:w="4644" w:type="dxa"/>
           </w:tcPr>
           <w:p>
             <w:r>
@@ -2611,7 +3150,7 @@
         </w:tc>
         <w:tc>
           <w:tcPr>
-            <w:tcW w:w="4320" w:type="dxa"/>
+            <w:tcW w:w="5543" w:type="dxa"/>
           </w:tcPr>
           <w:p>
             <w:r>
@@ -2623,7 +3162,7 @@
       <w:tr>
         <w:tc>
           <w:tcPr>
-            <w:tcW w:w="4320" w:type="dxa"/>
+            <w:tcW w:w="4644" w:type="dxa"/>
           </w:tcPr>
           <w:p>
             <w:r>
@@ -2633,7 +3172,7 @@
         </w:tc>
         <w:tc>
           <w:tcPr>
-            <w:tcW w:w="4320" w:type="dxa"/>
+            <w:tcW w:w="5543" w:type="dxa"/>
           </w:tcPr>
           <w:p>
             <w:r>
@@ -2645,7 +3184,7 @@
       <w:tr>
         <w:tc>
           <w:tcPr>
-            <w:tcW w:w="4320" w:type="dxa"/>
+            <w:tcW w:w="4644" w:type="dxa"/>
           </w:tcPr>
           <w:p>
             <w:r>
@@ -2655,7 +3194,7 @@
         </w:tc>
         <w:tc>
           <w:tcPr>
-            <w:tcW w:w="4320" w:type="dxa"/>
+            <w:tcW w:w="5543" w:type="dxa"/>
           </w:tcPr>
           <w:p/>
         </w:tc>
@@ -2663,7 +3202,7 @@
       <w:tr>
         <w:tc>
           <w:tcPr>
-            <w:tcW w:w="4320" w:type="dxa"/>
+            <w:tcW w:w="4644" w:type="dxa"/>
           </w:tcPr>
           <w:p>
             <w:r>
@@ -2673,7 +3212,7 @@
         </w:tc>
         <w:tc>
           <w:tcPr>
-            <w:tcW w:w="4320" w:type="dxa"/>
+            <w:tcW w:w="5543" w:type="dxa"/>
           </w:tcPr>
           <w:p>
             <w:r>
@@ -2691,17 +3230,17 @@
     <w:tbl>
       <w:tblPr>
         <w:tblStyle w:val="Tabellenraster"/>
-        <w:tblW w:w="0" w:type="auto"/>
+        <w:tblW w:w="5000" w:type="pct"/>
         <w:tblLook w:val="04A0" w:firstRow="1" w:lastRow="0" w:firstColumn="1" w:lastColumn="0" w:noHBand="0" w:noVBand="1"/>
       </w:tblPr>
       <w:tblGrid>
-        <w:gridCol w:w="4320"/>
-        <w:gridCol w:w="4320"/>
+        <w:gridCol w:w="4644"/>
+        <w:gridCol w:w="5543"/>
       </w:tblGrid>
       <w:tr>
         <w:tc>
           <w:tcPr>
-            <w:tcW w:w="4320" w:type="dxa"/>
+            <w:tcW w:w="4644" w:type="dxa"/>
           </w:tcPr>
           <w:p>
             <w:pPr>
@@ -2722,7 +3261,7 @@
         </w:tc>
         <w:tc>
           <w:tcPr>
-            <w:tcW w:w="4320" w:type="dxa"/>
+            <w:tcW w:w="5543" w:type="dxa"/>
           </w:tcPr>
           <w:p>
             <w:pPr>
@@ -2752,7 +3291,7 @@
       <w:tr>
         <w:tc>
           <w:tcPr>
-            <w:tcW w:w="4320" w:type="dxa"/>
+            <w:tcW w:w="4644" w:type="dxa"/>
           </w:tcPr>
           <w:p>
             <w:r>
@@ -2762,11 +3301,19 @@
         </w:tc>
         <w:tc>
           <w:tcPr>
-            <w:tcW w:w="4320" w:type="dxa"/>
-          </w:tcPr>
-          <w:p>
-            <w:r>
-              <w:t>Das Angebot der INN-Büro GmbH in der Fachzeitsc...</w:t>
+            <w:tcW w:w="5543" w:type="dxa"/>
+          </w:tcPr>
+          <w:p>
+            <w:r>
+              <w:t xml:space="preserve">Das Angebot der INN-Büro GmbH in der </w:t>
+            </w:r>
+            <w:proofErr w:type="spellStart"/>
+            <w:r>
+              <w:t>Fachzeitsc</w:t>
+            </w:r>
+            <w:proofErr w:type="spellEnd"/>
+            <w:r>
+              <w:t>...</w:t>
             </w:r>
           </w:p>
         </w:tc>
@@ -2774,7 +3321,7 @@
       <w:tr>
         <w:tc>
           <w:tcPr>
-            <w:tcW w:w="4320" w:type="dxa"/>
+            <w:tcW w:w="4644" w:type="dxa"/>
           </w:tcPr>
           <w:p>
             <w:r>
@@ -2784,7 +3331,7 @@
         </w:tc>
         <w:tc>
           <w:tcPr>
-            <w:tcW w:w="4320" w:type="dxa"/>
+            <w:tcW w:w="5543" w:type="dxa"/>
           </w:tcPr>
           <w:p/>
         </w:tc>
@@ -2792,7 +3339,7 @@
       <w:tr>
         <w:tc>
           <w:tcPr>
-            <w:tcW w:w="4320" w:type="dxa"/>
+            <w:tcW w:w="4644" w:type="dxa"/>
           </w:tcPr>
           <w:p>
             <w:r>
@@ -2802,7 +3349,7 @@
         </w:tc>
         <w:tc>
           <w:tcPr>
-            <w:tcW w:w="4320" w:type="dxa"/>
+            <w:tcW w:w="5543" w:type="dxa"/>
           </w:tcPr>
           <w:p>
             <w:r>
@@ -2827,7 +3374,7 @@
       <w:tr>
         <w:tc>
           <w:tcPr>
-            <w:tcW w:w="4320" w:type="dxa"/>
+            <w:tcW w:w="4644" w:type="dxa"/>
           </w:tcPr>
           <w:p>
             <w:r>
@@ -2837,7 +3384,7 @@
         </w:tc>
         <w:tc>
           <w:tcPr>
-            <w:tcW w:w="4320" w:type="dxa"/>
+            <w:tcW w:w="5543" w:type="dxa"/>
           </w:tcPr>
           <w:p/>
         </w:tc>
@@ -2845,7 +3392,7 @@
       <w:tr>
         <w:tc>
           <w:tcPr>
-            <w:tcW w:w="4320" w:type="dxa"/>
+            <w:tcW w:w="4644" w:type="dxa"/>
           </w:tcPr>
           <w:p>
             <w:r>
@@ -2855,7 +3402,7 @@
         </w:tc>
         <w:tc>
           <w:tcPr>
-            <w:tcW w:w="4320" w:type="dxa"/>
+            <w:tcW w:w="5543" w:type="dxa"/>
           </w:tcPr>
           <w:p/>
         </w:tc>
@@ -2863,7 +3410,7 @@
       <w:tr>
         <w:tc>
           <w:tcPr>
-            <w:tcW w:w="4320" w:type="dxa"/>
+            <w:tcW w:w="4644" w:type="dxa"/>
           </w:tcPr>
           <w:p>
             <w:r>
@@ -2873,7 +3420,7 @@
         </w:tc>
         <w:tc>
           <w:tcPr>
-            <w:tcW w:w="4320" w:type="dxa"/>
+            <w:tcW w:w="5543" w:type="dxa"/>
           </w:tcPr>
           <w:p>
             <w:r>
@@ -2885,7 +3432,7 @@
       <w:tr>
         <w:tc>
           <w:tcPr>
-            <w:tcW w:w="4320" w:type="dxa"/>
+            <w:tcW w:w="4644" w:type="dxa"/>
           </w:tcPr>
           <w:p>
             <w:r>
@@ -2895,7 +3442,7 @@
         </w:tc>
         <w:tc>
           <w:tcPr>
-            <w:tcW w:w="4320" w:type="dxa"/>
+            <w:tcW w:w="5543" w:type="dxa"/>
           </w:tcPr>
           <w:p>
             <w:r>
@@ -2907,7 +3454,7 @@
       <w:tr>
         <w:tc>
           <w:tcPr>
-            <w:tcW w:w="4320" w:type="dxa"/>
+            <w:tcW w:w="4644" w:type="dxa"/>
           </w:tcPr>
           <w:p>
             <w:r>
@@ -2917,7 +3464,7 @@
         </w:tc>
         <w:tc>
           <w:tcPr>
-            <w:tcW w:w="4320" w:type="dxa"/>
+            <w:tcW w:w="5543" w:type="dxa"/>
           </w:tcPr>
           <w:p/>
         </w:tc>
@@ -2925,7 +3472,7 @@
       <w:tr>
         <w:tc>
           <w:tcPr>
-            <w:tcW w:w="4320" w:type="dxa"/>
+            <w:tcW w:w="4644" w:type="dxa"/>
           </w:tcPr>
           <w:p>
             <w:r>
@@ -2935,7 +3482,7 @@
         </w:tc>
         <w:tc>
           <w:tcPr>
-            <w:tcW w:w="4320" w:type="dxa"/>
+            <w:tcW w:w="5543" w:type="dxa"/>
           </w:tcPr>
           <w:p>
             <w:r>
@@ -2953,17 +3500,17 @@
     <w:tbl>
       <w:tblPr>
         <w:tblStyle w:val="Tabellenraster"/>
-        <w:tblW w:w="0" w:type="auto"/>
+        <w:tblW w:w="5000" w:type="pct"/>
         <w:tblLook w:val="04A0" w:firstRow="1" w:lastRow="0" w:firstColumn="1" w:lastColumn="0" w:noHBand="0" w:noVBand="1"/>
       </w:tblPr>
       <w:tblGrid>
-        <w:gridCol w:w="4320"/>
-        <w:gridCol w:w="4320"/>
+        <w:gridCol w:w="4644"/>
+        <w:gridCol w:w="5543"/>
       </w:tblGrid>
       <w:tr>
         <w:tc>
           <w:tcPr>
-            <w:tcW w:w="4320" w:type="dxa"/>
+            <w:tcW w:w="4644" w:type="dxa"/>
           </w:tcPr>
           <w:p>
             <w:r>
@@ -2973,7 +3520,7 @@
         </w:tc>
         <w:tc>
           <w:tcPr>
-            <w:tcW w:w="4320" w:type="dxa"/>
+            <w:tcW w:w="5543" w:type="dxa"/>
           </w:tcPr>
           <w:p>
             <w:r>
@@ -2988,7 +3535,7 @@
       <w:tr>
         <w:tc>
           <w:tcPr>
-            <w:tcW w:w="4320" w:type="dxa"/>
+            <w:tcW w:w="4644" w:type="dxa"/>
           </w:tcPr>
           <w:p>
             <w:r>
@@ -2998,11 +3545,19 @@
         </w:tc>
         <w:tc>
           <w:tcPr>
-            <w:tcW w:w="4320" w:type="dxa"/>
-          </w:tcPr>
-          <w:p>
-            <w:r>
-              <w:t>Erläutern Sie einen Vorteil für die INN-Büro Gm...</w:t>
+            <w:tcW w:w="5543" w:type="dxa"/>
+          </w:tcPr>
+          <w:p>
+            <w:r>
+              <w:t xml:space="preserve">Erläutern Sie einen Vorteil für die INN-Büro </w:t>
+            </w:r>
+            <w:proofErr w:type="spellStart"/>
+            <w:r>
+              <w:t>Gm</w:t>
+            </w:r>
+            <w:proofErr w:type="spellEnd"/>
+            <w:r>
+              <w:t>...</w:t>
             </w:r>
           </w:p>
         </w:tc>
@@ -3010,7 +3565,7 @@
       <w:tr>
         <w:tc>
           <w:tcPr>
-            <w:tcW w:w="4320" w:type="dxa"/>
+            <w:tcW w:w="4644" w:type="dxa"/>
           </w:tcPr>
           <w:p>
             <w:r>
@@ -3020,7 +3575,7 @@
         </w:tc>
         <w:tc>
           <w:tcPr>
-            <w:tcW w:w="4320" w:type="dxa"/>
+            <w:tcW w:w="5543" w:type="dxa"/>
           </w:tcPr>
           <w:p/>
         </w:tc>
@@ -3028,7 +3583,7 @@
       <w:tr>
         <w:tc>
           <w:tcPr>
-            <w:tcW w:w="4320" w:type="dxa"/>
+            <w:tcW w:w="4644" w:type="dxa"/>
           </w:tcPr>
           <w:p>
             <w:r>
@@ -3038,7 +3593,7 @@
         </w:tc>
         <w:tc>
           <w:tcPr>
-            <w:tcW w:w="4320" w:type="dxa"/>
+            <w:tcW w:w="5543" w:type="dxa"/>
           </w:tcPr>
           <w:p>
             <w:r>
@@ -3052,19 +3607,19 @@
               <w:br/>
             </w:r>
             <w:r>
-              <w:br/>
-            </w:r>
-            <w:r>
               <w:lastRenderedPageBreak/>
               <w:br/>
             </w:r>
+            <w:r>
+              <w:br/>
+            </w:r>
           </w:p>
         </w:tc>
       </w:tr>
       <w:tr>
         <w:tc>
           <w:tcPr>
-            <w:tcW w:w="4320" w:type="dxa"/>
+            <w:tcW w:w="4644" w:type="dxa"/>
           </w:tcPr>
           <w:p>
             <w:r>
@@ -3075,7 +3630,7 @@
         </w:tc>
         <w:tc>
           <w:tcPr>
-            <w:tcW w:w="4320" w:type="dxa"/>
+            <w:tcW w:w="5543" w:type="dxa"/>
           </w:tcPr>
           <w:p/>
         </w:tc>
@@ -3083,7 +3638,7 @@
       <w:tr>
         <w:tc>
           <w:tcPr>
-            <w:tcW w:w="4320" w:type="dxa"/>
+            <w:tcW w:w="4644" w:type="dxa"/>
           </w:tcPr>
           <w:p>
             <w:r>
@@ -3093,7 +3648,7 @@
         </w:tc>
         <w:tc>
           <w:tcPr>
-            <w:tcW w:w="4320" w:type="dxa"/>
+            <w:tcW w:w="5543" w:type="dxa"/>
           </w:tcPr>
           <w:p>
             <w:r>
@@ -3105,7 +3660,7 @@
       <w:tr>
         <w:tc>
           <w:tcPr>
-            <w:tcW w:w="4320" w:type="dxa"/>
+            <w:tcW w:w="4644" w:type="dxa"/>
           </w:tcPr>
           <w:p>
             <w:r>
@@ -3115,7 +3670,7 @@
         </w:tc>
         <w:tc>
           <w:tcPr>
-            <w:tcW w:w="4320" w:type="dxa"/>
+            <w:tcW w:w="5543" w:type="dxa"/>
           </w:tcPr>
           <w:p>
             <w:r>
@@ -3127,7 +3682,7 @@
       <w:tr>
         <w:tc>
           <w:tcPr>
-            <w:tcW w:w="4320" w:type="dxa"/>
+            <w:tcW w:w="4644" w:type="dxa"/>
           </w:tcPr>
           <w:p>
             <w:r>
@@ -3137,7 +3692,7 @@
         </w:tc>
         <w:tc>
           <w:tcPr>
-            <w:tcW w:w="4320" w:type="dxa"/>
+            <w:tcW w:w="5543" w:type="dxa"/>
           </w:tcPr>
           <w:p>
             <w:r>
@@ -3149,7 +3704,7 @@
       <w:tr>
         <w:tc>
           <w:tcPr>
-            <w:tcW w:w="4320" w:type="dxa"/>
+            <w:tcW w:w="4644" w:type="dxa"/>
           </w:tcPr>
           <w:p>
             <w:r>
@@ -3159,7 +3714,7 @@
         </w:tc>
         <w:tc>
           <w:tcPr>
-            <w:tcW w:w="4320" w:type="dxa"/>
+            <w:tcW w:w="5543" w:type="dxa"/>
           </w:tcPr>
           <w:p/>
         </w:tc>
@@ -3167,7 +3722,7 @@
       <w:tr>
         <w:tc>
           <w:tcPr>
-            <w:tcW w:w="4320" w:type="dxa"/>
+            <w:tcW w:w="4644" w:type="dxa"/>
           </w:tcPr>
           <w:p>
             <w:r>
@@ -3177,7 +3732,7 @@
         </w:tc>
         <w:tc>
           <w:tcPr>
-            <w:tcW w:w="4320" w:type="dxa"/>
+            <w:tcW w:w="5543" w:type="dxa"/>
           </w:tcPr>
           <w:p>
             <w:r>
@@ -3195,17 +3750,17 @@
     <w:tbl>
       <w:tblPr>
         <w:tblStyle w:val="Tabellenraster"/>
-        <w:tblW w:w="0" w:type="auto"/>
+        <w:tblW w:w="5000" w:type="pct"/>
         <w:tblLook w:val="04A0" w:firstRow="1" w:lastRow="0" w:firstColumn="1" w:lastColumn="0" w:noHBand="0" w:noVBand="1"/>
       </w:tblPr>
       <w:tblGrid>
-        <w:gridCol w:w="4320"/>
-        <w:gridCol w:w="4320"/>
+        <w:gridCol w:w="4644"/>
+        <w:gridCol w:w="5543"/>
       </w:tblGrid>
       <w:tr>
         <w:tc>
           <w:tcPr>
-            <w:tcW w:w="4320" w:type="dxa"/>
+            <w:tcW w:w="4644" w:type="dxa"/>
           </w:tcPr>
           <w:p>
             <w:pPr>
@@ -3226,7 +3781,7 @@
         </w:tc>
         <w:tc>
           <w:tcPr>
-            <w:tcW w:w="4320" w:type="dxa"/>
+            <w:tcW w:w="5543" w:type="dxa"/>
           </w:tcPr>
           <w:p>
             <w:pPr>
@@ -3256,7 +3811,7 @@
       <w:tr>
         <w:tc>
           <w:tcPr>
-            <w:tcW w:w="4320" w:type="dxa"/>
+            <w:tcW w:w="4644" w:type="dxa"/>
           </w:tcPr>
           <w:p>
             <w:r>
@@ -3266,11 +3821,19 @@
         </w:tc>
         <w:tc>
           <w:tcPr>
-            <w:tcW w:w="4320" w:type="dxa"/>
-          </w:tcPr>
-          <w:p>
-            <w:r>
-              <w:t>Geben Sie an, zu welchem Zeitpunkt die Livingst...</w:t>
+            <w:tcW w:w="5543" w:type="dxa"/>
+          </w:tcPr>
+          <w:p>
+            <w:r>
+              <w:t xml:space="preserve">Geben Sie an, zu welchem Zeitpunkt die </w:t>
+            </w:r>
+            <w:proofErr w:type="spellStart"/>
+            <w:r>
+              <w:t>Livingst</w:t>
+            </w:r>
+            <w:proofErr w:type="spellEnd"/>
+            <w:r>
+              <w:t>...</w:t>
             </w:r>
           </w:p>
         </w:tc>
@@ -3278,7 +3841,7 @@
       <w:tr>
         <w:tc>
           <w:tcPr>
-            <w:tcW w:w="4320" w:type="dxa"/>
+            <w:tcW w:w="4644" w:type="dxa"/>
           </w:tcPr>
           <w:p>
             <w:r>
@@ -3288,7 +3851,7 @@
         </w:tc>
         <w:tc>
           <w:tcPr>
-            <w:tcW w:w="4320" w:type="dxa"/>
+            <w:tcW w:w="5543" w:type="dxa"/>
           </w:tcPr>
           <w:p/>
         </w:tc>
@@ -3296,7 +3859,7 @@
       <w:tr>
         <w:tc>
           <w:tcPr>
-            <w:tcW w:w="4320" w:type="dxa"/>
+            <w:tcW w:w="4644" w:type="dxa"/>
           </w:tcPr>
           <w:p>
             <w:r>
@@ -3306,7 +3869,7 @@
         </w:tc>
         <w:tc>
           <w:tcPr>
-            <w:tcW w:w="4320" w:type="dxa"/>
+            <w:tcW w:w="5543" w:type="dxa"/>
           </w:tcPr>
           <w:p>
             <w:r>
@@ -3331,7 +3894,7 @@
       <w:tr>
         <w:tc>
           <w:tcPr>
-            <w:tcW w:w="4320" w:type="dxa"/>
+            <w:tcW w:w="4644" w:type="dxa"/>
           </w:tcPr>
           <w:p>
             <w:r>
@@ -3341,7 +3904,7 @@
         </w:tc>
         <w:tc>
           <w:tcPr>
-            <w:tcW w:w="4320" w:type="dxa"/>
+            <w:tcW w:w="5543" w:type="dxa"/>
           </w:tcPr>
           <w:p/>
         </w:tc>
@@ -3349,7 +3912,7 @@
       <w:tr>
         <w:tc>
           <w:tcPr>
-            <w:tcW w:w="4320" w:type="dxa"/>
+            <w:tcW w:w="4644" w:type="dxa"/>
           </w:tcPr>
           <w:p>
             <w:r>
@@ -3359,7 +3922,7 @@
         </w:tc>
         <w:tc>
           <w:tcPr>
-            <w:tcW w:w="4320" w:type="dxa"/>
+            <w:tcW w:w="5543" w:type="dxa"/>
           </w:tcPr>
           <w:p/>
         </w:tc>
@@ -3367,7 +3930,7 @@
       <w:tr>
         <w:tc>
           <w:tcPr>
-            <w:tcW w:w="4320" w:type="dxa"/>
+            <w:tcW w:w="4644" w:type="dxa"/>
           </w:tcPr>
           <w:p>
             <w:r>
@@ -3377,7 +3940,7 @@
         </w:tc>
         <w:tc>
           <w:tcPr>
-            <w:tcW w:w="4320" w:type="dxa"/>
+            <w:tcW w:w="5543" w:type="dxa"/>
           </w:tcPr>
           <w:p>
             <w:r>
@@ -3389,7 +3952,7 @@
       <w:tr>
         <w:tc>
           <w:tcPr>
-            <w:tcW w:w="4320" w:type="dxa"/>
+            <w:tcW w:w="4644" w:type="dxa"/>
           </w:tcPr>
           <w:p>
             <w:r>
@@ -3399,7 +3962,7 @@
         </w:tc>
         <w:tc>
           <w:tcPr>
-            <w:tcW w:w="4320" w:type="dxa"/>
+            <w:tcW w:w="5543" w:type="dxa"/>
           </w:tcPr>
           <w:p>
             <w:r>
@@ -3411,7 +3974,7 @@
       <w:tr>
         <w:tc>
           <w:tcPr>
-            <w:tcW w:w="4320" w:type="dxa"/>
+            <w:tcW w:w="4644" w:type="dxa"/>
           </w:tcPr>
           <w:p>
             <w:r>
@@ -3421,7 +3984,7 @@
         </w:tc>
         <w:tc>
           <w:tcPr>
-            <w:tcW w:w="4320" w:type="dxa"/>
+            <w:tcW w:w="5543" w:type="dxa"/>
           </w:tcPr>
           <w:p/>
         </w:tc>
@@ -3429,7 +3992,7 @@
       <w:tr>
         <w:tc>
           <w:tcPr>
-            <w:tcW w:w="4320" w:type="dxa"/>
+            <w:tcW w:w="4644" w:type="dxa"/>
           </w:tcPr>
           <w:p>
             <w:r>
@@ -3439,7 +4002,7 @@
         </w:tc>
         <w:tc>
           <w:tcPr>
-            <w:tcW w:w="4320" w:type="dxa"/>
+            <w:tcW w:w="5543" w:type="dxa"/>
           </w:tcPr>
           <w:p>
             <w:r>
@@ -3457,17 +4020,17 @@
     <w:tbl>
       <w:tblPr>
         <w:tblStyle w:val="Tabellenraster"/>
-        <w:tblW w:w="0" w:type="auto"/>
+        <w:tblW w:w="5000" w:type="pct"/>
         <w:tblLook w:val="04A0" w:firstRow="1" w:lastRow="0" w:firstColumn="1" w:lastColumn="0" w:noHBand="0" w:noVBand="1"/>
       </w:tblPr>
       <w:tblGrid>
-        <w:gridCol w:w="4320"/>
-        <w:gridCol w:w="4320"/>
+        <w:gridCol w:w="4644"/>
+        <w:gridCol w:w="5543"/>
       </w:tblGrid>
       <w:tr>
         <w:tc>
           <w:tcPr>
-            <w:tcW w:w="4320" w:type="dxa"/>
+            <w:tcW w:w="4644" w:type="dxa"/>
           </w:tcPr>
           <w:p>
             <w:pPr>
@@ -3488,7 +4051,7 @@
         </w:tc>
         <w:tc>
           <w:tcPr>
-            <w:tcW w:w="4320" w:type="dxa"/>
+            <w:tcW w:w="5543" w:type="dxa"/>
           </w:tcPr>
           <w:p>
             <w:pPr>
@@ -3518,7 +4081,7 @@
       <w:tr>
         <w:tc>
           <w:tcPr>
-            <w:tcW w:w="4320" w:type="dxa"/>
+            <w:tcW w:w="4644" w:type="dxa"/>
           </w:tcPr>
           <w:p>
             <w:r>
@@ -3528,11 +4091,19 @@
         </w:tc>
         <w:tc>
           <w:tcPr>
-            <w:tcW w:w="4320" w:type="dxa"/>
-          </w:tcPr>
-          <w:p>
-            <w:r>
-              <w:t>Die fehlende Zahlung hätte die INN-Büro GmbH no...</w:t>
+            <w:tcW w:w="5543" w:type="dxa"/>
+          </w:tcPr>
+          <w:p>
+            <w:r>
+              <w:t xml:space="preserve">Die fehlende Zahlung hätte die INN-Büro GmbH </w:t>
+            </w:r>
+            <w:proofErr w:type="spellStart"/>
+            <w:r>
+              <w:t>no</w:t>
+            </w:r>
+            <w:proofErr w:type="spellEnd"/>
+            <w:r>
+              <w:t>...</w:t>
             </w:r>
           </w:p>
         </w:tc>
@@ -3540,7 +4111,7 @@
       <w:tr>
         <w:tc>
           <w:tcPr>
-            <w:tcW w:w="4320" w:type="dxa"/>
+            <w:tcW w:w="4644" w:type="dxa"/>
           </w:tcPr>
           <w:p>
             <w:r>
@@ -3550,7 +4121,7 @@
         </w:tc>
         <w:tc>
           <w:tcPr>
-            <w:tcW w:w="4320" w:type="dxa"/>
+            <w:tcW w:w="5543" w:type="dxa"/>
           </w:tcPr>
           <w:p/>
         </w:tc>
@@ -3558,7 +4129,7 @@
       <w:tr>
         <w:tc>
           <w:tcPr>
-            <w:tcW w:w="4320" w:type="dxa"/>
+            <w:tcW w:w="4644" w:type="dxa"/>
           </w:tcPr>
           <w:p>
             <w:r>
@@ -3568,7 +4139,7 @@
         </w:tc>
         <w:tc>
           <w:tcPr>
-            <w:tcW w:w="4320" w:type="dxa"/>
+            <w:tcW w:w="5543" w:type="dxa"/>
           </w:tcPr>
           <w:p>
             <w:r>
@@ -3593,7 +4164,7 @@
       <w:tr>
         <w:tc>
           <w:tcPr>
-            <w:tcW w:w="4320" w:type="dxa"/>
+            <w:tcW w:w="4644" w:type="dxa"/>
           </w:tcPr>
           <w:p>
             <w:r>
@@ -3603,7 +4174,7 @@
         </w:tc>
         <w:tc>
           <w:tcPr>
-            <w:tcW w:w="4320" w:type="dxa"/>
+            <w:tcW w:w="5543" w:type="dxa"/>
           </w:tcPr>
           <w:p/>
         </w:tc>
@@ -3611,7 +4182,7 @@
       <w:tr>
         <w:tc>
           <w:tcPr>
-            <w:tcW w:w="4320" w:type="dxa"/>
+            <w:tcW w:w="4644" w:type="dxa"/>
           </w:tcPr>
           <w:p>
             <w:r>
@@ -3621,7 +4192,7 @@
         </w:tc>
         <w:tc>
           <w:tcPr>
-            <w:tcW w:w="4320" w:type="dxa"/>
+            <w:tcW w:w="5543" w:type="dxa"/>
           </w:tcPr>
           <w:p/>
         </w:tc>
@@ -3629,7 +4200,7 @@
       <w:tr>
         <w:tc>
           <w:tcPr>
-            <w:tcW w:w="4320" w:type="dxa"/>
+            <w:tcW w:w="4644" w:type="dxa"/>
           </w:tcPr>
           <w:p>
             <w:r>
@@ -3639,7 +4210,7 @@
         </w:tc>
         <w:tc>
           <w:tcPr>
-            <w:tcW w:w="4320" w:type="dxa"/>
+            <w:tcW w:w="5543" w:type="dxa"/>
           </w:tcPr>
           <w:p>
             <w:r>
@@ -3651,7 +4222,7 @@
       <w:tr>
         <w:tc>
           <w:tcPr>
-            <w:tcW w:w="4320" w:type="dxa"/>
+            <w:tcW w:w="4644" w:type="dxa"/>
           </w:tcPr>
           <w:p>
             <w:r>
@@ -3661,7 +4232,7 @@
         </w:tc>
         <w:tc>
           <w:tcPr>
-            <w:tcW w:w="4320" w:type="dxa"/>
+            <w:tcW w:w="5543" w:type="dxa"/>
           </w:tcPr>
           <w:p>
             <w:r>
@@ -3673,7 +4244,7 @@
       <w:tr>
         <w:tc>
           <w:tcPr>
-            <w:tcW w:w="4320" w:type="dxa"/>
+            <w:tcW w:w="4644" w:type="dxa"/>
           </w:tcPr>
           <w:p>
             <w:r>
@@ -3683,7 +4254,7 @@
         </w:tc>
         <w:tc>
           <w:tcPr>
-            <w:tcW w:w="4320" w:type="dxa"/>
+            <w:tcW w:w="5543" w:type="dxa"/>
           </w:tcPr>
           <w:p/>
         </w:tc>
@@ -3691,18 +4262,17 @@
       <w:tr>
         <w:tc>
           <w:tcPr>
-            <w:tcW w:w="4320" w:type="dxa"/>
-          </w:tcPr>
-          <w:p>
-            <w:r>
-              <w:lastRenderedPageBreak/>
+            <w:tcW w:w="4644" w:type="dxa"/>
+          </w:tcPr>
+          <w:p>
+            <w:r>
               <w:t>Kategorie</w:t>
             </w:r>
           </w:p>
         </w:tc>
         <w:tc>
           <w:tcPr>
-            <w:tcW w:w="4320" w:type="dxa"/>
+            <w:tcW w:w="5543" w:type="dxa"/>
           </w:tcPr>
           <w:p>
             <w:r>
@@ -3720,17 +4290,17 @@
     <w:tbl>
       <w:tblPr>
         <w:tblStyle w:val="Tabellenraster"/>
-        <w:tblW w:w="0" w:type="auto"/>
+        <w:tblW w:w="5000" w:type="pct"/>
         <w:tblLook w:val="04A0" w:firstRow="1" w:lastRow="0" w:firstColumn="1" w:lastColumn="0" w:noHBand="0" w:noVBand="1"/>
       </w:tblPr>
       <w:tblGrid>
-        <w:gridCol w:w="4320"/>
-        <w:gridCol w:w="5527"/>
+        <w:gridCol w:w="4644"/>
+        <w:gridCol w:w="5543"/>
       </w:tblGrid>
       <w:tr>
         <w:tc>
           <w:tcPr>
-            <w:tcW w:w="4320" w:type="dxa"/>
+            <w:tcW w:w="4644" w:type="dxa"/>
           </w:tcPr>
           <w:p>
             <w:pPr>
@@ -3745,13 +4315,14 @@
                 <w:rFonts w:asciiTheme="minorHAnsi" w:hAnsiTheme="minorHAnsi"/>
                 <w:lang w:val="en-US"/>
               </w:rPr>
+              <w:lastRenderedPageBreak/>
               <w:t>ID</w:t>
             </w:r>
           </w:p>
         </w:tc>
         <w:tc>
           <w:tcPr>
-            <w:tcW w:w="4320" w:type="dxa"/>
+            <w:tcW w:w="5543" w:type="dxa"/>
           </w:tcPr>
           <w:p>
             <w:pPr>
@@ -3781,7 +4352,7 @@
       <w:tr>
         <w:tc>
           <w:tcPr>
-            <w:tcW w:w="4320" w:type="dxa"/>
+            <w:tcW w:w="4644" w:type="dxa"/>
           </w:tcPr>
           <w:p>
             <w:r>
@@ -3791,7 +4362,7 @@
         </w:tc>
         <w:tc>
           <w:tcPr>
-            <w:tcW w:w="4320" w:type="dxa"/>
+            <w:tcW w:w="5543" w:type="dxa"/>
           </w:tcPr>
           <w:p>
             <w:r>
@@ -3803,7 +4374,7 @@
       <w:tr>
         <w:tc>
           <w:tcPr>
-            <w:tcW w:w="4320" w:type="dxa"/>
+            <w:tcW w:w="4644" w:type="dxa"/>
           </w:tcPr>
           <w:p>
             <w:r>
@@ -3813,7 +4384,7 @@
         </w:tc>
         <w:tc>
           <w:tcPr>
-            <w:tcW w:w="4320" w:type="dxa"/>
+            <w:tcW w:w="5543" w:type="dxa"/>
           </w:tcPr>
           <w:p/>
         </w:tc>
@@ -3821,7 +4392,7 @@
       <w:tr>
         <w:tc>
           <w:tcPr>
-            <w:tcW w:w="4320" w:type="dxa"/>
+            <w:tcW w:w="4644" w:type="dxa"/>
           </w:tcPr>
           <w:p>
             <w:r>
@@ -3831,7 +4402,7 @@
         </w:tc>
         <w:tc>
           <w:tcPr>
-            <w:tcW w:w="4320" w:type="dxa"/>
+            <w:tcW w:w="5543" w:type="dxa"/>
           </w:tcPr>
           <w:p>
             <w:r>
@@ -3870,7 +4441,7 @@
       <w:tr>
         <w:tc>
           <w:tcPr>
-            <w:tcW w:w="4320" w:type="dxa"/>
+            <w:tcW w:w="4644" w:type="dxa"/>
           </w:tcPr>
           <w:p>
             <w:r>
@@ -3880,7 +4451,7 @@
         </w:tc>
         <w:tc>
           <w:tcPr>
-            <w:tcW w:w="4320" w:type="dxa"/>
+            <w:tcW w:w="5543" w:type="dxa"/>
           </w:tcPr>
           <w:p/>
         </w:tc>
@@ -3888,7 +4459,7 @@
       <w:tr>
         <w:tc>
           <w:tcPr>
-            <w:tcW w:w="4320" w:type="dxa"/>
+            <w:tcW w:w="4644" w:type="dxa"/>
           </w:tcPr>
           <w:p>
             <w:r>
@@ -3898,7 +4469,7 @@
         </w:tc>
         <w:tc>
           <w:tcPr>
-            <w:tcW w:w="4320" w:type="dxa"/>
+            <w:tcW w:w="5543" w:type="dxa"/>
           </w:tcPr>
           <w:p/>
         </w:tc>
@@ -3906,7 +4477,7 @@
       <w:tr>
         <w:tc>
           <w:tcPr>
-            <w:tcW w:w="4320" w:type="dxa"/>
+            <w:tcW w:w="4644" w:type="dxa"/>
           </w:tcPr>
           <w:p>
             <w:r>
@@ -3916,7 +4487,7 @@
         </w:tc>
         <w:tc>
           <w:tcPr>
-            <w:tcW w:w="4320" w:type="dxa"/>
+            <w:tcW w:w="5543" w:type="dxa"/>
           </w:tcPr>
           <w:p>
             <w:r>
@@ -3928,7 +4499,7 @@
       <w:tr>
         <w:tc>
           <w:tcPr>
-            <w:tcW w:w="4320" w:type="dxa"/>
+            <w:tcW w:w="4644" w:type="dxa"/>
           </w:tcPr>
           <w:p>
             <w:r>
@@ -3938,7 +4509,7 @@
         </w:tc>
         <w:tc>
           <w:tcPr>
-            <w:tcW w:w="4320" w:type="dxa"/>
+            <w:tcW w:w="5543" w:type="dxa"/>
           </w:tcPr>
           <w:p>
             <w:r>
@@ -3950,7 +4521,7 @@
       <w:tr>
         <w:tc>
           <w:tcPr>
-            <w:tcW w:w="4320" w:type="dxa"/>
+            <w:tcW w:w="4644" w:type="dxa"/>
           </w:tcPr>
           <w:p>
             <w:r>
@@ -3960,7 +4531,7 @@
         </w:tc>
         <w:tc>
           <w:tcPr>
-            <w:tcW w:w="5527" w:type="dxa"/>
+            <w:tcW w:w="5543" w:type="dxa"/>
           </w:tcPr>
           <w:p/>
         </w:tc>
@@ -3968,7 +4539,7 @@
       <w:tr>
         <w:tc>
           <w:tcPr>
-            <w:tcW w:w="4320" w:type="dxa"/>
+            <w:tcW w:w="4644" w:type="dxa"/>
           </w:tcPr>
           <w:p>
             <w:r>
@@ -3978,7 +4549,7 @@
         </w:tc>
         <w:tc>
           <w:tcPr>
-            <w:tcW w:w="5527" w:type="dxa"/>
+            <w:tcW w:w="5543" w:type="dxa"/>
           </w:tcPr>
           <w:p>
             <w:r>
@@ -3996,17 +4567,17 @@
     <w:tbl>
       <w:tblPr>
         <w:tblStyle w:val="Tabellenraster"/>
-        <w:tblW w:w="0" w:type="auto"/>
+        <w:tblW w:w="5000" w:type="pct"/>
         <w:tblLook w:val="04A0" w:firstRow="1" w:lastRow="0" w:firstColumn="1" w:lastColumn="0" w:noHBand="0" w:noVBand="1"/>
       </w:tblPr>
       <w:tblGrid>
-        <w:gridCol w:w="4320"/>
-        <w:gridCol w:w="4320"/>
+        <w:gridCol w:w="4644"/>
+        <w:gridCol w:w="5543"/>
       </w:tblGrid>
       <w:tr>
         <w:tc>
           <w:tcPr>
-            <w:tcW w:w="4320" w:type="dxa"/>
+            <w:tcW w:w="4644" w:type="dxa"/>
           </w:tcPr>
           <w:p>
             <w:pPr>
@@ -4027,7 +4598,7 @@
         </w:tc>
         <w:tc>
           <w:tcPr>
-            <w:tcW w:w="4320" w:type="dxa"/>
+            <w:tcW w:w="5543" w:type="dxa"/>
           </w:tcPr>
           <w:p>
             <w:pPr>
@@ -4050,7 +4621,7 @@
       <w:tr>
         <w:tc>
           <w:tcPr>
-            <w:tcW w:w="4320" w:type="dxa"/>
+            <w:tcW w:w="4644" w:type="dxa"/>
           </w:tcPr>
           <w:p>
             <w:r>
@@ -4060,19 +4631,24 @@
         </w:tc>
         <w:tc>
           <w:tcPr>
-            <w:tcW w:w="4320" w:type="dxa"/>
-          </w:tcPr>
-          <w:p>
-            <w:r>
-              <w:t>Berechnen Sie die Selbstkosten für die Sonder-A...</w:t>
-            </w:r>
+            <w:tcW w:w="5543" w:type="dxa"/>
+          </w:tcPr>
+          <w:p>
+            <w:r>
+              <w:t>Berechnen Sie die Selbstkosten für die Sonder-</w:t>
+            </w:r>
+            <w:proofErr w:type="gramStart"/>
+            <w:r>
+              <w:t>A...</w:t>
+            </w:r>
+            <w:proofErr w:type="gramEnd"/>
           </w:p>
         </w:tc>
       </w:tr>
       <w:tr>
         <w:tc>
           <w:tcPr>
-            <w:tcW w:w="4320" w:type="dxa"/>
+            <w:tcW w:w="4644" w:type="dxa"/>
           </w:tcPr>
           <w:p>
             <w:r>
@@ -4082,7 +4658,7 @@
         </w:tc>
         <w:tc>
           <w:tcPr>
-            <w:tcW w:w="4320" w:type="dxa"/>
+            <w:tcW w:w="5543" w:type="dxa"/>
           </w:tcPr>
           <w:p>
             <w:r>
@@ -4090,7 +4666,15 @@
             </w:r>
             <w:r>
               <w:br/>
-              <w:t>Die INN-Büro GmbH bietet Sonder-Ausgaben ihrer Auswahl hochwertiger Schreibtische an. Ein neuer Kunde, die GoroTech UG, bittet um ein Angebot für den Schreibtisch 'ErgoDesk' in der Variante mit Tischplatte aus Walnuss-Holz, Edelstahl-Rahmen und -Untergestell.</w:t>
+              <w:t>Die INN-Büro GmbH bietet Sonder-Ausgaben ihrer Auswahl hochwertiger Schreibtische an. Ein neuer Kunde, die GoroTech UG, bittet um ein Angebot für den Schreibtisch '</w:t>
+            </w:r>
+            <w:proofErr w:type="spellStart"/>
+            <w:r>
+              <w:t>ErgoDesk</w:t>
+            </w:r>
+            <w:proofErr w:type="spellEnd"/>
+            <w:r>
+              <w:t>' in der Variante mit Tischplatte aus Walnuss-Holz, Edelstahl-Rahmen und -Untergestell.</w:t>
             </w:r>
             <w:r>
               <w:br/>
@@ -4111,9 +4695,6 @@
             </w:r>
             <w:r>
               <w:br/>
-            </w:r>
-            <w:r>
-              <w:lastRenderedPageBreak/>
               <w:t>38 % Materialgemeinkostenzuschlagssatz</w:t>
             </w:r>
             <w:r>
@@ -4133,7 +4714,11 @@
             </w:r>
             <w:r>
               <w:br/>
-              <w:t>Für die Preiskalkulationen liegen Ihnen folgende Richtwerte vor:</w:t>
+              <w:t xml:space="preserve">Für die Preiskalkulationen liegen Ihnen folgende Richtwerte </w:t>
+            </w:r>
+            <w:r>
+              <w:lastRenderedPageBreak/>
+              <w:t>vor:</w:t>
             </w:r>
             <w:r>
               <w:br/>
@@ -4165,7 +4750,7 @@
       <w:tr>
         <w:tc>
           <w:tcPr>
-            <w:tcW w:w="4320" w:type="dxa"/>
+            <w:tcW w:w="4644" w:type="dxa"/>
           </w:tcPr>
           <w:p>
             <w:r>
@@ -4176,11 +4761,19 @@
         </w:tc>
         <w:tc>
           <w:tcPr>
-            <w:tcW w:w="4320" w:type="dxa"/>
-          </w:tcPr>
-          <w:p>
-            <w:r>
-              <w:t xml:space="preserve">Berechnen Sie die Selbstkosten für die Sonder-Ausgabe des Schreibtisches 'ErgoDesk' in Walnuss-Holz/Edelstahl sowie den Listenverkaufspreis (netto). </w:t>
+            <w:tcW w:w="5543" w:type="dxa"/>
+          </w:tcPr>
+          <w:p>
+            <w:r>
+              <w:t>Berechnen Sie die Selbstkosten für die Sonder-Ausgabe des Schreibtisches '</w:t>
+            </w:r>
+            <w:proofErr w:type="spellStart"/>
+            <w:r>
+              <w:t>ErgoDesk</w:t>
+            </w:r>
+            <w:proofErr w:type="spellEnd"/>
+            <w:r>
+              <w:t xml:space="preserve">' in Walnuss-Holz/Edelstahl sowie den Listenverkaufspreis (netto). </w:t>
             </w:r>
             <w:r>
               <w:br/>
@@ -4201,7 +4794,7 @@
       <w:tr>
         <w:tc>
           <w:tcPr>
-            <w:tcW w:w="4320" w:type="dxa"/>
+            <w:tcW w:w="4644" w:type="dxa"/>
           </w:tcPr>
           <w:p>
             <w:r>
@@ -4211,7 +4804,7 @@
         </w:tc>
         <w:tc>
           <w:tcPr>
-            <w:tcW w:w="4320" w:type="dxa"/>
+            <w:tcW w:w="5543" w:type="dxa"/>
           </w:tcPr>
           <w:p/>
         </w:tc>
@@ -4219,7 +4812,7 @@
       <w:tr>
         <w:tc>
           <w:tcPr>
-            <w:tcW w:w="4320" w:type="dxa"/>
+            <w:tcW w:w="4644" w:type="dxa"/>
           </w:tcPr>
           <w:p>
             <w:r>
@@ -4229,7 +4822,7 @@
         </w:tc>
         <w:tc>
           <w:tcPr>
-            <w:tcW w:w="4320" w:type="dxa"/>
+            <w:tcW w:w="5543" w:type="dxa"/>
           </w:tcPr>
           <w:p/>
         </w:tc>
@@ -4237,7 +4830,7 @@
       <w:tr>
         <w:tc>
           <w:tcPr>
-            <w:tcW w:w="4320" w:type="dxa"/>
+            <w:tcW w:w="4644" w:type="dxa"/>
           </w:tcPr>
           <w:p>
             <w:r>
@@ -4247,7 +4840,7 @@
         </w:tc>
         <w:tc>
           <w:tcPr>
-            <w:tcW w:w="4320" w:type="dxa"/>
+            <w:tcW w:w="5543" w:type="dxa"/>
           </w:tcPr>
           <w:p>
             <w:r>
@@ -4259,7 +4852,7 @@
       <w:tr>
         <w:tc>
           <w:tcPr>
-            <w:tcW w:w="4320" w:type="dxa"/>
+            <w:tcW w:w="4644" w:type="dxa"/>
           </w:tcPr>
           <w:p>
             <w:r>
@@ -4269,7 +4862,7 @@
         </w:tc>
         <w:tc>
           <w:tcPr>
-            <w:tcW w:w="4320" w:type="dxa"/>
+            <w:tcW w:w="5543" w:type="dxa"/>
           </w:tcPr>
           <w:p>
             <w:r>
@@ -4281,7 +4874,7 @@
       <w:tr>
         <w:tc>
           <w:tcPr>
-            <w:tcW w:w="4320" w:type="dxa"/>
+            <w:tcW w:w="4644" w:type="dxa"/>
           </w:tcPr>
           <w:p>
             <w:r>
@@ -4291,7 +4884,7 @@
         </w:tc>
         <w:tc>
           <w:tcPr>
-            <w:tcW w:w="4320" w:type="dxa"/>
+            <w:tcW w:w="5543" w:type="dxa"/>
           </w:tcPr>
           <w:p/>
         </w:tc>
@@ -4299,7 +4892,7 @@
       <w:tr>
         <w:tc>
           <w:tcPr>
-            <w:tcW w:w="4320" w:type="dxa"/>
+            <w:tcW w:w="4644" w:type="dxa"/>
           </w:tcPr>
           <w:p>
             <w:r>
@@ -4309,7 +4902,7 @@
         </w:tc>
         <w:tc>
           <w:tcPr>
-            <w:tcW w:w="4320" w:type="dxa"/>
+            <w:tcW w:w="5543" w:type="dxa"/>
           </w:tcPr>
           <w:p>
             <w:r>
@@ -4327,17 +4920,17 @@
     <w:tbl>
       <w:tblPr>
         <w:tblStyle w:val="Tabellenraster"/>
-        <w:tblW w:w="0" w:type="auto"/>
+        <w:tblW w:w="5000" w:type="pct"/>
         <w:tblLook w:val="04A0" w:firstRow="1" w:lastRow="0" w:firstColumn="1" w:lastColumn="0" w:noHBand="0" w:noVBand="1"/>
       </w:tblPr>
       <w:tblGrid>
-        <w:gridCol w:w="4320"/>
-        <w:gridCol w:w="4320"/>
+        <w:gridCol w:w="4644"/>
+        <w:gridCol w:w="5543"/>
       </w:tblGrid>
       <w:tr>
         <w:tc>
           <w:tcPr>
-            <w:tcW w:w="4320" w:type="dxa"/>
+            <w:tcW w:w="4644" w:type="dxa"/>
           </w:tcPr>
           <w:p>
             <w:pPr>
@@ -4358,7 +4951,7 @@
         </w:tc>
         <w:tc>
           <w:tcPr>
-            <w:tcW w:w="4320" w:type="dxa"/>
+            <w:tcW w:w="5543" w:type="dxa"/>
           </w:tcPr>
           <w:p>
             <w:pPr>
@@ -4388,7 +4981,7 @@
       <w:tr>
         <w:tc>
           <w:tcPr>
-            <w:tcW w:w="4320" w:type="dxa"/>
+            <w:tcW w:w="4644" w:type="dxa"/>
           </w:tcPr>
           <w:p>
             <w:r>
@@ -4398,7 +4991,7 @@
         </w:tc>
         <w:tc>
           <w:tcPr>
-            <w:tcW w:w="4320" w:type="dxa"/>
+            <w:tcW w:w="5543" w:type="dxa"/>
           </w:tcPr>
           <w:p>
             <w:r>
@@ -4410,7 +5003,7 @@
       <w:tr>
         <w:tc>
           <w:tcPr>
-            <w:tcW w:w="4320" w:type="dxa"/>
+            <w:tcW w:w="4644" w:type="dxa"/>
           </w:tcPr>
           <w:p>
             <w:r>
@@ -4420,7 +5013,7 @@
         </w:tc>
         <w:tc>
           <w:tcPr>
-            <w:tcW w:w="4320" w:type="dxa"/>
+            <w:tcW w:w="5543" w:type="dxa"/>
           </w:tcPr>
           <w:p/>
         </w:tc>
@@ -4428,7 +5021,7 @@
       <w:tr>
         <w:tc>
           <w:tcPr>
-            <w:tcW w:w="4320" w:type="dxa"/>
+            <w:tcW w:w="4644" w:type="dxa"/>
           </w:tcPr>
           <w:p>
             <w:r>
@@ -4438,11 +5031,19 @@
         </w:tc>
         <w:tc>
           <w:tcPr>
-            <w:tcW w:w="4320" w:type="dxa"/>
-          </w:tcPr>
-          <w:p>
-            <w:r>
-              <w:t>Welcher Preis kann für diese Variante des Schreibtisches 'ErgoDesk' als langfristige Preisuntergrenze angesetzt werden?</w:t>
+            <w:tcW w:w="5543" w:type="dxa"/>
+          </w:tcPr>
+          <w:p>
+            <w:r>
+              <w:t>Welcher Preis kann für diese Variante des Schreibtisches '</w:t>
+            </w:r>
+            <w:proofErr w:type="spellStart"/>
+            <w:r>
+              <w:t>ErgoDesk</w:t>
+            </w:r>
+            <w:proofErr w:type="spellEnd"/>
+            <w:r>
+              <w:t>' als langfristige Preisuntergrenze angesetzt werden?</w:t>
             </w:r>
             <w:r>
               <w:tab/>
@@ -4463,7 +5064,7 @@
       <w:tr>
         <w:tc>
           <w:tcPr>
-            <w:tcW w:w="4320" w:type="dxa"/>
+            <w:tcW w:w="4644" w:type="dxa"/>
           </w:tcPr>
           <w:p>
             <w:r>
@@ -4473,7 +5074,7 @@
         </w:tc>
         <w:tc>
           <w:tcPr>
-            <w:tcW w:w="4320" w:type="dxa"/>
+            <w:tcW w:w="5543" w:type="dxa"/>
           </w:tcPr>
           <w:p/>
         </w:tc>
@@ -4481,7 +5082,7 @@
       <w:tr>
         <w:tc>
           <w:tcPr>
-            <w:tcW w:w="4320" w:type="dxa"/>
+            <w:tcW w:w="4644" w:type="dxa"/>
           </w:tcPr>
           <w:p>
             <w:r>
@@ -4491,7 +5092,7 @@
         </w:tc>
         <w:tc>
           <w:tcPr>
-            <w:tcW w:w="4320" w:type="dxa"/>
+            <w:tcW w:w="5543" w:type="dxa"/>
           </w:tcPr>
           <w:p/>
         </w:tc>
@@ -4499,7 +5100,7 @@
       <w:tr>
         <w:tc>
           <w:tcPr>
-            <w:tcW w:w="4320" w:type="dxa"/>
+            <w:tcW w:w="4644" w:type="dxa"/>
           </w:tcPr>
           <w:p>
             <w:r>
@@ -4509,7 +5110,7 @@
         </w:tc>
         <w:tc>
           <w:tcPr>
-            <w:tcW w:w="4320" w:type="dxa"/>
+            <w:tcW w:w="5543" w:type="dxa"/>
           </w:tcPr>
           <w:p>
             <w:r>
@@ -4521,7 +5122,7 @@
       <w:tr>
         <w:tc>
           <w:tcPr>
-            <w:tcW w:w="4320" w:type="dxa"/>
+            <w:tcW w:w="4644" w:type="dxa"/>
           </w:tcPr>
           <w:p>
             <w:r>
@@ -4531,7 +5132,7 @@
         </w:tc>
         <w:tc>
           <w:tcPr>
-            <w:tcW w:w="4320" w:type="dxa"/>
+            <w:tcW w:w="5543" w:type="dxa"/>
           </w:tcPr>
           <w:p>
             <w:r>
@@ -4543,7 +5144,7 @@
       <w:tr>
         <w:tc>
           <w:tcPr>
-            <w:tcW w:w="4320" w:type="dxa"/>
+            <w:tcW w:w="4644" w:type="dxa"/>
           </w:tcPr>
           <w:p>
             <w:r>
@@ -4553,7 +5154,7 @@
         </w:tc>
         <w:tc>
           <w:tcPr>
-            <w:tcW w:w="4320" w:type="dxa"/>
+            <w:tcW w:w="5543" w:type="dxa"/>
           </w:tcPr>
           <w:p/>
         </w:tc>
@@ -4561,18 +5162,17 @@
       <w:tr>
         <w:tc>
           <w:tcPr>
-            <w:tcW w:w="4320" w:type="dxa"/>
-          </w:tcPr>
-          <w:p>
-            <w:r>
-              <w:lastRenderedPageBreak/>
+            <w:tcW w:w="4644" w:type="dxa"/>
+          </w:tcPr>
+          <w:p>
+            <w:r>
               <w:t>Kategorie</w:t>
             </w:r>
           </w:p>
         </w:tc>
         <w:tc>
           <w:tcPr>
-            <w:tcW w:w="4320" w:type="dxa"/>
+            <w:tcW w:w="5543" w:type="dxa"/>
           </w:tcPr>
           <w:p>
             <w:r>
@@ -5656,7 +6256,7 @@
   <w:style w:type="paragraph" w:default="1" w:styleId="Standard">
     <w:name w:val="Normal"/>
     <w:qFormat/>
-    <w:rsid w:val="00D605C5"/>
+    <w:rsid w:val="00C43494"/>
     <w:pPr>
       <w:spacing w:after="0" w:line="264" w:lineRule="auto"/>
     </w:pPr>

</xml_diff>